<commit_message>
understood 1's complement and smr representation of -ve ints
</commit_message>
<xml_diff>
--- a/C++ REBOOT NOTES/C++ EXTRA NOTES (STORAGE FORMATS).docx
+++ b/C++ REBOOT NOTES/C++ EXTRA NOTES (STORAGE FORMATS).docx
@@ -40,7 +40,119 @@
     </w:p>
     <w:p>
       <w:r>
-        <w:t xml:space="preserve">Computer sirf numbers (0, 1) samajhta hai, lekin humein text, symbols aur numbers handle karne hote hain. Inko computer ki bhasha mein convert karne ke liye jo "Translator" ya codes use hote hain, unhe </w:t>
+        <w:t xml:space="preserve">Computer </w:t>
+      </w:r>
+      <w:proofErr w:type="spellStart"/>
+      <w:r>
+        <w:t>sirf</w:t>
+      </w:r>
+      <w:proofErr w:type="spellEnd"/>
+      <w:r>
+        <w:t xml:space="preserve"> numbers (0, 1) </w:t>
+      </w:r>
+      <w:proofErr w:type="spellStart"/>
+      <w:r>
+        <w:t>samajhta</w:t>
+      </w:r>
+      <w:proofErr w:type="spellEnd"/>
+      <w:r>
+        <w:t xml:space="preserve"> </w:t>
+      </w:r>
+      <w:proofErr w:type="spellStart"/>
+      <w:r>
+        <w:t>hai</w:t>
+      </w:r>
+      <w:proofErr w:type="spellEnd"/>
+      <w:r>
+        <w:t xml:space="preserve">, </w:t>
+      </w:r>
+      <w:proofErr w:type="spellStart"/>
+      <w:r>
+        <w:t>lekin</w:t>
+      </w:r>
+      <w:proofErr w:type="spellEnd"/>
+      <w:r>
+        <w:t xml:space="preserve"> </w:t>
+      </w:r>
+      <w:proofErr w:type="spellStart"/>
+      <w:r>
+        <w:t>humein</w:t>
+      </w:r>
+      <w:proofErr w:type="spellEnd"/>
+      <w:r>
+        <w:t xml:space="preserve"> text, symbols aur numbers handle </w:t>
+      </w:r>
+      <w:proofErr w:type="spellStart"/>
+      <w:r>
+        <w:t>karne</w:t>
+      </w:r>
+      <w:proofErr w:type="spellEnd"/>
+      <w:r>
+        <w:t xml:space="preserve"> </w:t>
+      </w:r>
+      <w:proofErr w:type="spellStart"/>
+      <w:r>
+        <w:t>hote</w:t>
+      </w:r>
+      <w:proofErr w:type="spellEnd"/>
+      <w:r>
+        <w:t xml:space="preserve"> hain. Inko computer ki bhasha </w:t>
+      </w:r>
+      <w:proofErr w:type="spellStart"/>
+      <w:r>
+        <w:t>mein</w:t>
+      </w:r>
+      <w:proofErr w:type="spellEnd"/>
+      <w:r>
+        <w:t xml:space="preserve"> convert </w:t>
+      </w:r>
+      <w:proofErr w:type="spellStart"/>
+      <w:r>
+        <w:t>karne</w:t>
+      </w:r>
+      <w:proofErr w:type="spellEnd"/>
+      <w:r>
+        <w:t xml:space="preserve"> </w:t>
+      </w:r>
+      <w:proofErr w:type="spellStart"/>
+      <w:r>
+        <w:t>ke</w:t>
+      </w:r>
+      <w:proofErr w:type="spellEnd"/>
+      <w:r>
+        <w:t xml:space="preserve"> </w:t>
+      </w:r>
+      <w:proofErr w:type="spellStart"/>
+      <w:r>
+        <w:t>liye</w:t>
+      </w:r>
+      <w:proofErr w:type="spellEnd"/>
+      <w:r>
+        <w:t xml:space="preserve"> jo "Translator" </w:t>
+      </w:r>
+      <w:proofErr w:type="spellStart"/>
+      <w:r>
+        <w:t>ya</w:t>
+      </w:r>
+      <w:proofErr w:type="spellEnd"/>
+      <w:r>
+        <w:t xml:space="preserve"> codes use </w:t>
+      </w:r>
+      <w:proofErr w:type="spellStart"/>
+      <w:r>
+        <w:t>hote</w:t>
+      </w:r>
+      <w:proofErr w:type="spellEnd"/>
+      <w:r>
+        <w:t xml:space="preserve"> hain, </w:t>
+      </w:r>
+      <w:proofErr w:type="spellStart"/>
+      <w:r>
+        <w:t>unhe</w:t>
+      </w:r>
+      <w:proofErr w:type="spellEnd"/>
+      <w:r>
+        <w:t xml:space="preserve"> </w:t>
       </w:r>
       <w:r>
         <w:rPr>
@@ -50,7 +162,15 @@
         <w:t>Alphanumeric Codes</w:t>
       </w:r>
       <w:r>
-        <w:t xml:space="preserve"> kehte hain.</w:t>
+        <w:t xml:space="preserve"> </w:t>
+      </w:r>
+      <w:proofErr w:type="spellStart"/>
+      <w:r>
+        <w:t>kehte</w:t>
+      </w:r>
+      <w:proofErr w:type="spellEnd"/>
+      <w:r>
+        <w:t xml:space="preserve"> hain.</w:t>
       </w:r>
     </w:p>
     <w:p>
@@ -77,7 +197,39 @@
     </w:p>
     <w:p>
       <w:r>
-        <w:t>Ye sabse zyada use hone wala standard hai.</w:t>
+        <w:t xml:space="preserve">Ye </w:t>
+      </w:r>
+      <w:proofErr w:type="spellStart"/>
+      <w:r>
+        <w:t>sabse</w:t>
+      </w:r>
+      <w:proofErr w:type="spellEnd"/>
+      <w:r>
+        <w:t xml:space="preserve"> </w:t>
+      </w:r>
+      <w:proofErr w:type="spellStart"/>
+      <w:r>
+        <w:t>zyada</w:t>
+      </w:r>
+      <w:proofErr w:type="spellEnd"/>
+      <w:r>
+        <w:t xml:space="preserve"> use hone </w:t>
+      </w:r>
+      <w:proofErr w:type="spellStart"/>
+      <w:r>
+        <w:t>wala</w:t>
+      </w:r>
+      <w:proofErr w:type="spellEnd"/>
+      <w:r>
+        <w:t xml:space="preserve"> standard </w:t>
+      </w:r>
+      <w:proofErr w:type="spellStart"/>
+      <w:r>
+        <w:t>hai</w:t>
+      </w:r>
+      <w:proofErr w:type="spellEnd"/>
+      <w:r>
+        <w:t>.</w:t>
       </w:r>
     </w:p>
     <w:p>
@@ -95,7 +247,15 @@
         <w:t>Size:</w:t>
       </w:r>
       <w:r>
-        <w:t xml:space="preserve"> Asli ASCII sirf </w:t>
+        <w:t xml:space="preserve"> Asli ASCII </w:t>
+      </w:r>
+      <w:proofErr w:type="spellStart"/>
+      <w:r>
+        <w:t>sirf</w:t>
+      </w:r>
+      <w:proofErr w:type="spellEnd"/>
+      <w:r>
+        <w:t xml:space="preserve"> </w:t>
       </w:r>
       <w:r>
         <w:rPr>
@@ -105,7 +265,23 @@
         <w:t>7 bits</w:t>
       </w:r>
       <w:r>
-        <w:t xml:space="preserve"> ka hota hai ($2^7 = 128$ characters).</w:t>
+        <w:t xml:space="preserve"> ka </w:t>
+      </w:r>
+      <w:proofErr w:type="spellStart"/>
+      <w:r>
+        <w:t>hota</w:t>
+      </w:r>
+      <w:proofErr w:type="spellEnd"/>
+      <w:r>
+        <w:t xml:space="preserve"> </w:t>
+      </w:r>
+      <w:proofErr w:type="spellStart"/>
+      <w:r>
+        <w:t>hai</w:t>
+      </w:r>
+      <w:proofErr w:type="spellEnd"/>
+      <w:r>
+        <w:t xml:space="preserve"> ($2^7 = 128$ characters).</w:t>
       </w:r>
     </w:p>
     <w:p>
@@ -123,7 +299,15 @@
         <w:t>Extended ASCII:</w:t>
       </w:r>
       <w:r>
-        <w:t xml:space="preserve"> Aaj kal hum </w:t>
+        <w:t xml:space="preserve"> </w:t>
+      </w:r>
+      <w:proofErr w:type="spellStart"/>
+      <w:r>
+        <w:t>Aaj</w:t>
+      </w:r>
+      <w:proofErr w:type="spellEnd"/>
+      <w:r>
+        <w:t xml:space="preserve"> kal hum </w:t>
       </w:r>
       <w:r>
         <w:rPr>
@@ -133,7 +317,39 @@
         <w:t>8 bits</w:t>
       </w:r>
       <w:r>
-        <w:t xml:space="preserve"> wala ASCII use karte hain jisme 256 characters hote hain.</w:t>
+        <w:t xml:space="preserve"> </w:t>
+      </w:r>
+      <w:proofErr w:type="spellStart"/>
+      <w:r>
+        <w:t>wala</w:t>
+      </w:r>
+      <w:proofErr w:type="spellEnd"/>
+      <w:r>
+        <w:t xml:space="preserve"> ASCII use </w:t>
+      </w:r>
+      <w:proofErr w:type="spellStart"/>
+      <w:r>
+        <w:t>karte</w:t>
+      </w:r>
+      <w:proofErr w:type="spellEnd"/>
+      <w:r>
+        <w:t xml:space="preserve"> hain </w:t>
+      </w:r>
+      <w:proofErr w:type="spellStart"/>
+      <w:r>
+        <w:t>jisme</w:t>
+      </w:r>
+      <w:proofErr w:type="spellEnd"/>
+      <w:r>
+        <w:t xml:space="preserve"> 256 characters </w:t>
+      </w:r>
+      <w:proofErr w:type="spellStart"/>
+      <w:r>
+        <w:t>hote</w:t>
+      </w:r>
+      <w:proofErr w:type="spellEnd"/>
+      <w:r>
+        <w:t xml:space="preserve"> hain.</w:t>
       </w:r>
     </w:p>
     <w:p>
@@ -151,7 +367,23 @@
         <w:t>Logic:</w:t>
       </w:r>
       <w:r>
-        <w:t xml:space="preserve"> Har character ka ek fixed number hota hai.</w:t>
+        <w:t xml:space="preserve"> Har character ka ek fixed number </w:t>
+      </w:r>
+      <w:proofErr w:type="spellStart"/>
+      <w:r>
+        <w:t>hota</w:t>
+      </w:r>
+      <w:proofErr w:type="spellEnd"/>
+      <w:r>
+        <w:t xml:space="preserve"> </w:t>
+      </w:r>
+      <w:proofErr w:type="spellStart"/>
+      <w:r>
+        <w:t>hai</w:t>
+      </w:r>
+      <w:proofErr w:type="spellEnd"/>
+      <w:r>
+        <w:t>.</w:t>
       </w:r>
     </w:p>
     <w:p>
@@ -205,7 +437,39 @@
         <w:t>'0'</w:t>
       </w:r>
       <w:r>
-        <w:t xml:space="preserve"> = 48 (Note: Keyboard wala '0' aur integer wala 0 alag hote hain).</w:t>
+        <w:t xml:space="preserve"> = 48 (Note: Keyboard </w:t>
+      </w:r>
+      <w:proofErr w:type="spellStart"/>
+      <w:r>
+        <w:t>wala</w:t>
+      </w:r>
+      <w:proofErr w:type="spellEnd"/>
+      <w:r>
+        <w:t xml:space="preserve"> '0' aur integer </w:t>
+      </w:r>
+      <w:proofErr w:type="spellStart"/>
+      <w:r>
+        <w:t>wala</w:t>
+      </w:r>
+      <w:proofErr w:type="spellEnd"/>
+      <w:r>
+        <w:t xml:space="preserve"> 0 </w:t>
+      </w:r>
+      <w:proofErr w:type="spellStart"/>
+      <w:r>
+        <w:t>alag</w:t>
+      </w:r>
+      <w:proofErr w:type="spellEnd"/>
+      <w:r>
+        <w:t xml:space="preserve"> </w:t>
+      </w:r>
+      <w:proofErr w:type="spellStart"/>
+      <w:r>
+        <w:t>hote</w:t>
+      </w:r>
+      <w:proofErr w:type="spellEnd"/>
+      <w:r>
+        <w:t xml:space="preserve"> hain).</w:t>
       </w:r>
     </w:p>
     <w:p>
@@ -248,7 +512,47 @@
         <w:t>IBM</w:t>
       </w:r>
       <w:r>
-        <w:t xml:space="preserve"> ne banaya tha apne mainframe computers ke liye.</w:t>
+        <w:t xml:space="preserve"> ne </w:t>
+      </w:r>
+      <w:proofErr w:type="spellStart"/>
+      <w:r>
+        <w:t>banaya</w:t>
+      </w:r>
+      <w:proofErr w:type="spellEnd"/>
+      <w:r>
+        <w:t xml:space="preserve"> </w:t>
+      </w:r>
+      <w:proofErr w:type="spellStart"/>
+      <w:r>
+        <w:t>tha</w:t>
+      </w:r>
+      <w:proofErr w:type="spellEnd"/>
+      <w:r>
+        <w:t xml:space="preserve"> </w:t>
+      </w:r>
+      <w:proofErr w:type="spellStart"/>
+      <w:r>
+        <w:t>apne</w:t>
+      </w:r>
+      <w:proofErr w:type="spellEnd"/>
+      <w:r>
+        <w:t xml:space="preserve"> mainframe computers </w:t>
+      </w:r>
+      <w:proofErr w:type="spellStart"/>
+      <w:r>
+        <w:t>ke</w:t>
+      </w:r>
+      <w:proofErr w:type="spellEnd"/>
+      <w:r>
+        <w:t xml:space="preserve"> </w:t>
+      </w:r>
+      <w:proofErr w:type="spellStart"/>
+      <w:r>
+        <w:t>liye</w:t>
+      </w:r>
+      <w:proofErr w:type="spellEnd"/>
+      <w:r>
+        <w:t>.</w:t>
       </w:r>
     </w:p>
     <w:p>
@@ -259,7 +563,15 @@
         </w:numPr>
       </w:pPr>
       <w:r>
-        <w:t xml:space="preserve">Ye bhi </w:t>
+        <w:t xml:space="preserve">Ye </w:t>
+      </w:r>
+      <w:proofErr w:type="spellStart"/>
+      <w:r>
+        <w:t>bhi</w:t>
+      </w:r>
+      <w:proofErr w:type="spellEnd"/>
+      <w:r>
+        <w:t xml:space="preserve"> </w:t>
       </w:r>
       <w:r>
         <w:rPr>
@@ -269,7 +581,15 @@
         <w:t>8-bit</w:t>
       </w:r>
       <w:r>
-        <w:t xml:space="preserve"> ka code hai.</w:t>
+        <w:t xml:space="preserve"> ka code </w:t>
+      </w:r>
+      <w:proofErr w:type="spellStart"/>
+      <w:r>
+        <w:t>hai</w:t>
+      </w:r>
+      <w:proofErr w:type="spellEnd"/>
+      <w:r>
+        <w:t>.</w:t>
       </w:r>
     </w:p>
     <w:p>
@@ -287,7 +607,119 @@
         <w:t>Point to remember:</w:t>
       </w:r>
       <w:r>
-        <w:t xml:space="preserve"> ASCII aur EBCDIC aapas mein compatible nahi hain. Yani ASCII ka 65 EBCDIC mein kuch aur ho sakta hai. Ye aaj kal sirf purane IBM systems mein hi milta hai.</w:t>
+        <w:t xml:space="preserve"> ASCII aur EBCDIC </w:t>
+      </w:r>
+      <w:proofErr w:type="spellStart"/>
+      <w:r>
+        <w:t>aapas</w:t>
+      </w:r>
+      <w:proofErr w:type="spellEnd"/>
+      <w:r>
+        <w:t xml:space="preserve"> </w:t>
+      </w:r>
+      <w:proofErr w:type="spellStart"/>
+      <w:r>
+        <w:t>mein</w:t>
+      </w:r>
+      <w:proofErr w:type="spellEnd"/>
+      <w:r>
+        <w:t xml:space="preserve"> compatible </w:t>
+      </w:r>
+      <w:proofErr w:type="spellStart"/>
+      <w:r>
+        <w:t>nahi</w:t>
+      </w:r>
+      <w:proofErr w:type="spellEnd"/>
+      <w:r>
+        <w:t xml:space="preserve"> hain. Yani ASCII ka 65 EBCDIC </w:t>
+      </w:r>
+      <w:proofErr w:type="spellStart"/>
+      <w:r>
+        <w:t>mein</w:t>
+      </w:r>
+      <w:proofErr w:type="spellEnd"/>
+      <w:r>
+        <w:t xml:space="preserve"> </w:t>
+      </w:r>
+      <w:proofErr w:type="spellStart"/>
+      <w:r>
+        <w:t>kuch</w:t>
+      </w:r>
+      <w:proofErr w:type="spellEnd"/>
+      <w:r>
+        <w:t xml:space="preserve"> aur </w:t>
+      </w:r>
+      <w:proofErr w:type="spellStart"/>
+      <w:r>
+        <w:t>ho</w:t>
+      </w:r>
+      <w:proofErr w:type="spellEnd"/>
+      <w:r>
+        <w:t xml:space="preserve"> </w:t>
+      </w:r>
+      <w:proofErr w:type="spellStart"/>
+      <w:r>
+        <w:t>sakta</w:t>
+      </w:r>
+      <w:proofErr w:type="spellEnd"/>
+      <w:r>
+        <w:t xml:space="preserve"> </w:t>
+      </w:r>
+      <w:proofErr w:type="spellStart"/>
+      <w:r>
+        <w:t>hai</w:t>
+      </w:r>
+      <w:proofErr w:type="spellEnd"/>
+      <w:r>
+        <w:t xml:space="preserve">. Ye </w:t>
+      </w:r>
+      <w:proofErr w:type="spellStart"/>
+      <w:r>
+        <w:t>aaj</w:t>
+      </w:r>
+      <w:proofErr w:type="spellEnd"/>
+      <w:r>
+        <w:t xml:space="preserve"> kal </w:t>
+      </w:r>
+      <w:proofErr w:type="spellStart"/>
+      <w:r>
+        <w:t>sirf</w:t>
+      </w:r>
+      <w:proofErr w:type="spellEnd"/>
+      <w:r>
+        <w:t xml:space="preserve"> </w:t>
+      </w:r>
+      <w:proofErr w:type="spellStart"/>
+      <w:r>
+        <w:t>purane</w:t>
+      </w:r>
+      <w:proofErr w:type="spellEnd"/>
+      <w:r>
+        <w:t xml:space="preserve"> IBM systems </w:t>
+      </w:r>
+      <w:proofErr w:type="spellStart"/>
+      <w:r>
+        <w:t>mein</w:t>
+      </w:r>
+      <w:proofErr w:type="spellEnd"/>
+      <w:r>
+        <w:t xml:space="preserve"> hi </w:t>
+      </w:r>
+      <w:proofErr w:type="spellStart"/>
+      <w:r>
+        <w:t>milta</w:t>
+      </w:r>
+      <w:proofErr w:type="spellEnd"/>
+      <w:r>
+        <w:t xml:space="preserve"> </w:t>
+      </w:r>
+      <w:proofErr w:type="spellStart"/>
+      <w:r>
+        <w:t>hai</w:t>
+      </w:r>
+      <w:proofErr w:type="spellEnd"/>
+      <w:r>
+        <w:t>.</w:t>
       </w:r>
     </w:p>
     <w:p>
@@ -314,7 +746,111 @@
     </w:p>
     <w:p>
       <w:r>
-        <w:t xml:space="preserve">ASCII ki sabse badi problem ye thi ki wo sirf English characters handle kar pata tha. Hindi, Chinese ya Emojis ke liye ASCII chota pad gaya. Isliye </w:t>
+        <w:t xml:space="preserve">ASCII ki </w:t>
+      </w:r>
+      <w:proofErr w:type="spellStart"/>
+      <w:r>
+        <w:t>sabse</w:t>
+      </w:r>
+      <w:proofErr w:type="spellEnd"/>
+      <w:r>
+        <w:t xml:space="preserve"> </w:t>
+      </w:r>
+      <w:proofErr w:type="spellStart"/>
+      <w:r>
+        <w:t>badi</w:t>
+      </w:r>
+      <w:proofErr w:type="spellEnd"/>
+      <w:r>
+        <w:t xml:space="preserve"> problem ye </w:t>
+      </w:r>
+      <w:proofErr w:type="spellStart"/>
+      <w:r>
+        <w:t>thi</w:t>
+      </w:r>
+      <w:proofErr w:type="spellEnd"/>
+      <w:r>
+        <w:t xml:space="preserve"> ki wo </w:t>
+      </w:r>
+      <w:proofErr w:type="spellStart"/>
+      <w:r>
+        <w:t>sirf</w:t>
+      </w:r>
+      <w:proofErr w:type="spellEnd"/>
+      <w:r>
+        <w:t xml:space="preserve"> English characters handle </w:t>
+      </w:r>
+      <w:proofErr w:type="spellStart"/>
+      <w:r>
+        <w:t>kar</w:t>
+      </w:r>
+      <w:proofErr w:type="spellEnd"/>
+      <w:r>
+        <w:t xml:space="preserve"> </w:t>
+      </w:r>
+      <w:proofErr w:type="spellStart"/>
+      <w:r>
+        <w:t>pata</w:t>
+      </w:r>
+      <w:proofErr w:type="spellEnd"/>
+      <w:r>
+        <w:t xml:space="preserve"> </w:t>
+      </w:r>
+      <w:proofErr w:type="spellStart"/>
+      <w:r>
+        <w:t>tha</w:t>
+      </w:r>
+      <w:proofErr w:type="spellEnd"/>
+      <w:r>
+        <w:t xml:space="preserve">. Hindi, Chinese </w:t>
+      </w:r>
+      <w:proofErr w:type="spellStart"/>
+      <w:r>
+        <w:t>ya</w:t>
+      </w:r>
+      <w:proofErr w:type="spellEnd"/>
+      <w:r>
+        <w:t xml:space="preserve"> Emojis </w:t>
+      </w:r>
+      <w:proofErr w:type="spellStart"/>
+      <w:r>
+        <w:t>ke</w:t>
+      </w:r>
+      <w:proofErr w:type="spellEnd"/>
+      <w:r>
+        <w:t xml:space="preserve"> </w:t>
+      </w:r>
+      <w:proofErr w:type="spellStart"/>
+      <w:r>
+        <w:t>liye</w:t>
+      </w:r>
+      <w:proofErr w:type="spellEnd"/>
+      <w:r>
+        <w:t xml:space="preserve"> ASCII </w:t>
+      </w:r>
+      <w:proofErr w:type="spellStart"/>
+      <w:r>
+        <w:t>chota</w:t>
+      </w:r>
+      <w:proofErr w:type="spellEnd"/>
+      <w:r>
+        <w:t xml:space="preserve"> pad </w:t>
+      </w:r>
+      <w:proofErr w:type="spellStart"/>
+      <w:r>
+        <w:t>gaya</w:t>
+      </w:r>
+      <w:proofErr w:type="spellEnd"/>
+      <w:r>
+        <w:t xml:space="preserve">. </w:t>
+      </w:r>
+      <w:proofErr w:type="spellStart"/>
+      <w:r>
+        <w:t>Isliye</w:t>
+      </w:r>
+      <w:proofErr w:type="spellEnd"/>
+      <w:r>
+        <w:t xml:space="preserve"> </w:t>
       </w:r>
       <w:r>
         <w:rPr>
@@ -324,7 +860,15 @@
         <w:t>UNICODE</w:t>
       </w:r>
       <w:r>
-        <w:t xml:space="preserve"> aaya.</w:t>
+        <w:t xml:space="preserve"> </w:t>
+      </w:r>
+      <w:proofErr w:type="spellStart"/>
+      <w:r>
+        <w:t>aaya</w:t>
+      </w:r>
+      <w:proofErr w:type="spellEnd"/>
+      <w:r>
+        <w:t>.</w:t>
       </w:r>
     </w:p>
     <w:p>
@@ -342,7 +886,39 @@
         <w:t>Purpose:</w:t>
       </w:r>
       <w:r>
-        <w:t xml:space="preserve"> Duniya ki har language ke har character ko ek unique number dena.</w:t>
+        <w:t xml:space="preserve"> Duniya ki </w:t>
+      </w:r>
+      <w:proofErr w:type="spellStart"/>
+      <w:r>
+        <w:t>har</w:t>
+      </w:r>
+      <w:proofErr w:type="spellEnd"/>
+      <w:r>
+        <w:t xml:space="preserve"> language </w:t>
+      </w:r>
+      <w:proofErr w:type="spellStart"/>
+      <w:r>
+        <w:t>ke</w:t>
+      </w:r>
+      <w:proofErr w:type="spellEnd"/>
+      <w:r>
+        <w:t xml:space="preserve"> </w:t>
+      </w:r>
+      <w:proofErr w:type="spellStart"/>
+      <w:r>
+        <w:t>har</w:t>
+      </w:r>
+      <w:proofErr w:type="spellEnd"/>
+      <w:r>
+        <w:t xml:space="preserve"> character ko ek unique number </w:t>
+      </w:r>
+      <w:proofErr w:type="spellStart"/>
+      <w:r>
+        <w:t>dena</w:t>
+      </w:r>
+      <w:proofErr w:type="spellEnd"/>
+      <w:r>
+        <w:t>.</w:t>
       </w:r>
     </w:p>
     <w:p>
@@ -360,7 +936,23 @@
         <w:t>UTF-8 (Unicode Transformation Format):</w:t>
       </w:r>
       <w:r>
-        <w:t xml:space="preserve"> Ye sabse famous encoding hai.</w:t>
+        <w:t xml:space="preserve"> Ye </w:t>
+      </w:r>
+      <w:proofErr w:type="spellStart"/>
+      <w:r>
+        <w:t>sabse</w:t>
+      </w:r>
+      <w:proofErr w:type="spellEnd"/>
+      <w:r>
+        <w:t xml:space="preserve"> famous encoding </w:t>
+      </w:r>
+      <w:proofErr w:type="spellStart"/>
+      <w:r>
+        <w:t>hai</w:t>
+      </w:r>
+      <w:proofErr w:type="spellEnd"/>
+      <w:r>
+        <w:t>.</w:t>
       </w:r>
     </w:p>
     <w:p>
@@ -371,7 +963,23 @@
         </w:numPr>
       </w:pPr>
       <w:r>
-        <w:t xml:space="preserve">Iski khasiyat ye hai ki ye </w:t>
+        <w:t xml:space="preserve">Iski </w:t>
+      </w:r>
+      <w:proofErr w:type="spellStart"/>
+      <w:r>
+        <w:t>khasiyat</w:t>
+      </w:r>
+      <w:proofErr w:type="spellEnd"/>
+      <w:r>
+        <w:t xml:space="preserve"> ye </w:t>
+      </w:r>
+      <w:proofErr w:type="spellStart"/>
+      <w:r>
+        <w:t>hai</w:t>
+      </w:r>
+      <w:proofErr w:type="spellEnd"/>
+      <w:r>
+        <w:t xml:space="preserve"> ki ye </w:t>
       </w:r>
       <w:r>
         <w:rPr>
@@ -381,7 +989,23 @@
         <w:t>Variable Length</w:t>
       </w:r>
       <w:r>
-        <w:t xml:space="preserve"> ka hota hai.</w:t>
+        <w:t xml:space="preserve"> ka </w:t>
+      </w:r>
+      <w:proofErr w:type="spellStart"/>
+      <w:r>
+        <w:t>hota</w:t>
+      </w:r>
+      <w:proofErr w:type="spellEnd"/>
+      <w:r>
+        <w:t xml:space="preserve"> </w:t>
+      </w:r>
+      <w:proofErr w:type="spellStart"/>
+      <w:r>
+        <w:t>hai</w:t>
+      </w:r>
+      <w:proofErr w:type="spellEnd"/>
+      <w:r>
+        <w:t>.</w:t>
       </w:r>
     </w:p>
     <w:p>
@@ -393,7 +1017,79 @@
       </w:pPr>
       <w:r>
         <w:lastRenderedPageBreak/>
-        <w:t>English akshar 1 byte (8-bit) mein store ho jayenge, lekin complex languages ya emojis 2, 3 ya 4 bytes le sakte hain.</w:t>
+        <w:t xml:space="preserve">English </w:t>
+      </w:r>
+      <w:proofErr w:type="spellStart"/>
+      <w:r>
+        <w:t>akshar</w:t>
+      </w:r>
+      <w:proofErr w:type="spellEnd"/>
+      <w:r>
+        <w:t xml:space="preserve"> </w:t>
+      </w:r>
+      <w:proofErr w:type="gramStart"/>
+      <w:r>
+        <w:t>1 byte</w:t>
+      </w:r>
+      <w:proofErr w:type="gramEnd"/>
+      <w:r>
+        <w:t xml:space="preserve"> (8-bit) </w:t>
+      </w:r>
+      <w:proofErr w:type="spellStart"/>
+      <w:r>
+        <w:t>mein</w:t>
+      </w:r>
+      <w:proofErr w:type="spellEnd"/>
+      <w:r>
+        <w:t xml:space="preserve"> store </w:t>
+      </w:r>
+      <w:proofErr w:type="spellStart"/>
+      <w:r>
+        <w:t>ho</w:t>
+      </w:r>
+      <w:proofErr w:type="spellEnd"/>
+      <w:r>
+        <w:t xml:space="preserve"> </w:t>
+      </w:r>
+      <w:proofErr w:type="spellStart"/>
+      <w:r>
+        <w:t>jayenge</w:t>
+      </w:r>
+      <w:proofErr w:type="spellEnd"/>
+      <w:r>
+        <w:t xml:space="preserve">, </w:t>
+      </w:r>
+      <w:proofErr w:type="spellStart"/>
+      <w:r>
+        <w:t>lekin</w:t>
+      </w:r>
+      <w:proofErr w:type="spellEnd"/>
+      <w:r>
+        <w:t xml:space="preserve"> complex languages </w:t>
+      </w:r>
+      <w:proofErr w:type="spellStart"/>
+      <w:r>
+        <w:t>ya</w:t>
+      </w:r>
+      <w:proofErr w:type="spellEnd"/>
+      <w:r>
+        <w:t xml:space="preserve"> emojis 2, 3 </w:t>
+      </w:r>
+      <w:proofErr w:type="spellStart"/>
+      <w:r>
+        <w:t>ya</w:t>
+      </w:r>
+      <w:proofErr w:type="spellEnd"/>
+      <w:r>
+        <w:t xml:space="preserve"> 4 bytes le </w:t>
+      </w:r>
+      <w:proofErr w:type="spellStart"/>
+      <w:r>
+        <w:t>sakte</w:t>
+      </w:r>
+      <w:proofErr w:type="spellEnd"/>
+      <w:r>
+        <w:t xml:space="preserve"> hain.</w:t>
       </w:r>
     </w:p>
     <w:p>
@@ -404,7 +1100,31 @@
         </w:numPr>
       </w:pPr>
       <w:r>
-        <w:t>Ye ASCII ke saath compatible hai.</w:t>
+        <w:t xml:space="preserve">Ye ASCII </w:t>
+      </w:r>
+      <w:proofErr w:type="spellStart"/>
+      <w:r>
+        <w:t>ke</w:t>
+      </w:r>
+      <w:proofErr w:type="spellEnd"/>
+      <w:r>
+        <w:t xml:space="preserve"> </w:t>
+      </w:r>
+      <w:proofErr w:type="spellStart"/>
+      <w:r>
+        <w:t>saath</w:t>
+      </w:r>
+      <w:proofErr w:type="spellEnd"/>
+      <w:r>
+        <w:t xml:space="preserve"> compatible </w:t>
+      </w:r>
+      <w:proofErr w:type="spellStart"/>
+      <w:r>
+        <w:t>hai</w:t>
+      </w:r>
+      <w:proofErr w:type="spellEnd"/>
+      <w:r>
+        <w:t>.</w:t>
       </w:r>
     </w:p>
     <w:p>
@@ -431,7 +1151,95 @@
     </w:p>
     <w:p>
       <w:r>
-        <w:t>Video mein sir ne ek bohot important baat chhedi: jab tum keyboard se 4 dabate ho, toh computer use integer 4 nahi, balki ASCII code 52 samajhta hai.</w:t>
+        <w:t xml:space="preserve">Video </w:t>
+      </w:r>
+      <w:proofErr w:type="spellStart"/>
+      <w:r>
+        <w:t>mein</w:t>
+      </w:r>
+      <w:proofErr w:type="spellEnd"/>
+      <w:r>
+        <w:t xml:space="preserve"> sir ne ek </w:t>
+      </w:r>
+      <w:proofErr w:type="spellStart"/>
+      <w:r>
+        <w:t>bohot</w:t>
+      </w:r>
+      <w:proofErr w:type="spellEnd"/>
+      <w:r>
+        <w:t xml:space="preserve"> important </w:t>
+      </w:r>
+      <w:proofErr w:type="spellStart"/>
+      <w:r>
+        <w:t>baat</w:t>
+      </w:r>
+      <w:proofErr w:type="spellEnd"/>
+      <w:r>
+        <w:t xml:space="preserve"> </w:t>
+      </w:r>
+      <w:proofErr w:type="spellStart"/>
+      <w:r>
+        <w:t>chhedi</w:t>
+      </w:r>
+      <w:proofErr w:type="spellEnd"/>
+      <w:r>
+        <w:t xml:space="preserve">: jab tum keyboard se 4 </w:t>
+      </w:r>
+      <w:proofErr w:type="spellStart"/>
+      <w:r>
+        <w:t>dabate</w:t>
+      </w:r>
+      <w:proofErr w:type="spellEnd"/>
+      <w:r>
+        <w:t xml:space="preserve"> </w:t>
+      </w:r>
+      <w:proofErr w:type="spellStart"/>
+      <w:r>
+        <w:t>ho</w:t>
+      </w:r>
+      <w:proofErr w:type="spellEnd"/>
+      <w:r>
+        <w:t xml:space="preserve">, </w:t>
+      </w:r>
+      <w:proofErr w:type="spellStart"/>
+      <w:r>
+        <w:t>toh</w:t>
+      </w:r>
+      <w:proofErr w:type="spellEnd"/>
+      <w:r>
+        <w:t xml:space="preserve"> computer use integer 4 </w:t>
+      </w:r>
+      <w:proofErr w:type="spellStart"/>
+      <w:r>
+        <w:t>nahi</w:t>
+      </w:r>
+      <w:proofErr w:type="spellEnd"/>
+      <w:r>
+        <w:t xml:space="preserve">, </w:t>
+      </w:r>
+      <w:proofErr w:type="spellStart"/>
+      <w:r>
+        <w:t>balki</w:t>
+      </w:r>
+      <w:proofErr w:type="spellEnd"/>
+      <w:r>
+        <w:t xml:space="preserve"> ASCII code 52 </w:t>
+      </w:r>
+      <w:proofErr w:type="spellStart"/>
+      <w:r>
+        <w:t>samajhta</w:t>
+      </w:r>
+      <w:proofErr w:type="spellEnd"/>
+      <w:r>
+        <w:t xml:space="preserve"> </w:t>
+      </w:r>
+      <w:proofErr w:type="spellStart"/>
+      <w:r>
+        <w:t>hai</w:t>
+      </w:r>
+      <w:proofErr w:type="spellEnd"/>
+      <w:r>
+        <w:t>.</w:t>
       </w:r>
     </w:p>
     <w:p>
@@ -449,7 +1257,23 @@
         <w:t>Char '4':</w:t>
       </w:r>
       <w:r>
-        <w:t xml:space="preserve"> Memory mein ASCII code 52 store hoga.</w:t>
+        <w:t xml:space="preserve"> Memory </w:t>
+      </w:r>
+      <w:proofErr w:type="spellStart"/>
+      <w:r>
+        <w:t>mein</w:t>
+      </w:r>
+      <w:proofErr w:type="spellEnd"/>
+      <w:r>
+        <w:t xml:space="preserve"> ASCII code 52 store </w:t>
+      </w:r>
+      <w:proofErr w:type="spellStart"/>
+      <w:r>
+        <w:t>hoga</w:t>
+      </w:r>
+      <w:proofErr w:type="spellEnd"/>
+      <w:r>
+        <w:t>.</w:t>
       </w:r>
     </w:p>
     <w:p>
@@ -467,12 +1291,108 @@
         <w:t>Int 4:</w:t>
       </w:r>
       <w:r>
-        <w:t xml:space="preserve"> Memory mein binary 0100 store hoga.</w:t>
-      </w:r>
-    </w:p>
-    <w:p>
-      <w:r>
-        <w:t>Toh jab hum C++ mein char c = '4'; likhte hain, toh computer background mein 52 ke saath khel raha hota hai.</w:t>
+        <w:t xml:space="preserve"> Memory </w:t>
+      </w:r>
+      <w:proofErr w:type="spellStart"/>
+      <w:r>
+        <w:t>mein</w:t>
+      </w:r>
+      <w:proofErr w:type="spellEnd"/>
+      <w:r>
+        <w:t xml:space="preserve"> binary 0100 store </w:t>
+      </w:r>
+      <w:proofErr w:type="spellStart"/>
+      <w:r>
+        <w:t>hoga</w:t>
+      </w:r>
+      <w:proofErr w:type="spellEnd"/>
+      <w:r>
+        <w:t>.</w:t>
+      </w:r>
+    </w:p>
+    <w:p>
+      <w:r>
+        <w:t xml:space="preserve">Toh jab hum C++ </w:t>
+      </w:r>
+      <w:proofErr w:type="spellStart"/>
+      <w:r>
+        <w:t>mein</w:t>
+      </w:r>
+      <w:proofErr w:type="spellEnd"/>
+      <w:r>
+        <w:t xml:space="preserve"> char c = '4'; </w:t>
+      </w:r>
+      <w:proofErr w:type="spellStart"/>
+      <w:r>
+        <w:t>likhte</w:t>
+      </w:r>
+      <w:proofErr w:type="spellEnd"/>
+      <w:r>
+        <w:t xml:space="preserve"> hain, </w:t>
+      </w:r>
+      <w:proofErr w:type="spellStart"/>
+      <w:r>
+        <w:t>toh</w:t>
+      </w:r>
+      <w:proofErr w:type="spellEnd"/>
+      <w:r>
+        <w:t xml:space="preserve"> computer background </w:t>
+      </w:r>
+      <w:proofErr w:type="spellStart"/>
+      <w:r>
+        <w:t>mein</w:t>
+      </w:r>
+      <w:proofErr w:type="spellEnd"/>
+      <w:r>
+        <w:t xml:space="preserve"> 52 </w:t>
+      </w:r>
+      <w:proofErr w:type="spellStart"/>
+      <w:r>
+        <w:t>ke</w:t>
+      </w:r>
+      <w:proofErr w:type="spellEnd"/>
+      <w:r>
+        <w:t xml:space="preserve"> </w:t>
+      </w:r>
+      <w:proofErr w:type="spellStart"/>
+      <w:r>
+        <w:t>saath</w:t>
+      </w:r>
+      <w:proofErr w:type="spellEnd"/>
+      <w:r>
+        <w:t xml:space="preserve"> </w:t>
+      </w:r>
+      <w:proofErr w:type="spellStart"/>
+      <w:r>
+        <w:t>khel</w:t>
+      </w:r>
+      <w:proofErr w:type="spellEnd"/>
+      <w:r>
+        <w:t xml:space="preserve"> </w:t>
+      </w:r>
+      <w:proofErr w:type="spellStart"/>
+      <w:r>
+        <w:t>raha</w:t>
+      </w:r>
+      <w:proofErr w:type="spellEnd"/>
+      <w:r>
+        <w:t xml:space="preserve"> </w:t>
+      </w:r>
+      <w:proofErr w:type="spellStart"/>
+      <w:r>
+        <w:t>hota</w:t>
+      </w:r>
+      <w:proofErr w:type="spellEnd"/>
+      <w:r>
+        <w:t xml:space="preserve"> </w:t>
+      </w:r>
+      <w:proofErr w:type="spellStart"/>
+      <w:r>
+        <w:t>hai</w:t>
+      </w:r>
+      <w:proofErr w:type="spellEnd"/>
+      <w:r>
+        <w:t>.</w:t>
       </w:r>
     </w:p>
     <w:p>
@@ -913,12 +1833,60 @@
           <w:b/>
           <w:bCs/>
         </w:rPr>
-        <w:t>1. Numbers ke Types (Representations)</w:t>
-      </w:r>
-    </w:p>
-    <w:p>
-      <w:r>
-        <w:t>Computer mein numbers do tarah ke hote hain:</w:t>
+        <w:t xml:space="preserve">1. Numbers </w:t>
+      </w:r>
+      <w:proofErr w:type="spellStart"/>
+      <w:r>
+        <w:rPr>
+          <w:b/>
+          <w:bCs/>
+        </w:rPr>
+        <w:t>ke</w:t>
+      </w:r>
+      <w:proofErr w:type="spellEnd"/>
+      <w:r>
+        <w:rPr>
+          <w:b/>
+          <w:bCs/>
+        </w:rPr>
+        <w:t xml:space="preserve"> Types (Representations)</w:t>
+      </w:r>
+    </w:p>
+    <w:p>
+      <w:r>
+        <w:t xml:space="preserve">Computer </w:t>
+      </w:r>
+      <w:proofErr w:type="spellStart"/>
+      <w:r>
+        <w:t>mein</w:t>
+      </w:r>
+      <w:proofErr w:type="spellEnd"/>
+      <w:r>
+        <w:t xml:space="preserve"> numbers do </w:t>
+      </w:r>
+      <w:proofErr w:type="spellStart"/>
+      <w:r>
+        <w:t>tarah</w:t>
+      </w:r>
+      <w:proofErr w:type="spellEnd"/>
+      <w:r>
+        <w:t xml:space="preserve"> </w:t>
+      </w:r>
+      <w:proofErr w:type="spellStart"/>
+      <w:r>
+        <w:t>ke</w:t>
+      </w:r>
+      <w:proofErr w:type="spellEnd"/>
+      <w:r>
+        <w:t xml:space="preserve"> </w:t>
+      </w:r>
+      <w:proofErr w:type="spellStart"/>
+      <w:r>
+        <w:t>hote</w:t>
+      </w:r>
+      <w:proofErr w:type="spellEnd"/>
+      <w:r>
+        <w:t xml:space="preserve"> hain:</w:t>
       </w:r>
     </w:p>
     <w:p>
@@ -936,7 +1904,47 @@
         <w:t>Unsigned Integers:</w:t>
       </w:r>
       <w:r>
-        <w:t xml:space="preserve"> Sirf positive numbers (jaise 0, 1, 2, ...). Isme koi sign bit nahi chahiye hoti.</w:t>
+        <w:t xml:space="preserve"> </w:t>
+      </w:r>
+      <w:proofErr w:type="spellStart"/>
+      <w:r>
+        <w:t>Sirf</w:t>
+      </w:r>
+      <w:proofErr w:type="spellEnd"/>
+      <w:r>
+        <w:t xml:space="preserve"> positive numbers (</w:t>
+      </w:r>
+      <w:proofErr w:type="spellStart"/>
+      <w:r>
+        <w:t>jaise</w:t>
+      </w:r>
+      <w:proofErr w:type="spellEnd"/>
+      <w:r>
+        <w:t xml:space="preserve"> 0, 1, 2, ...). Isme koi sign bit </w:t>
+      </w:r>
+      <w:proofErr w:type="spellStart"/>
+      <w:r>
+        <w:t>nahi</w:t>
+      </w:r>
+      <w:proofErr w:type="spellEnd"/>
+      <w:r>
+        <w:t xml:space="preserve"> </w:t>
+      </w:r>
+      <w:proofErr w:type="spellStart"/>
+      <w:r>
+        <w:t>chahiye</w:t>
+      </w:r>
+      <w:proofErr w:type="spellEnd"/>
+      <w:r>
+        <w:t xml:space="preserve"> </w:t>
+      </w:r>
+      <w:proofErr w:type="spellStart"/>
+      <w:r>
+        <w:t>hoti</w:t>
+      </w:r>
+      <w:proofErr w:type="spellEnd"/>
+      <w:r>
+        <w:t>.</w:t>
       </w:r>
     </w:p>
     <w:p>
@@ -954,7 +1962,63 @@
         <w:t>Signed Integers:</w:t>
       </w:r>
       <w:r>
-        <w:t xml:space="preserve"> Positive (+) aur Negative (-) dono numbers. Computer ko batana padta hai ki number negative hai ya nahi.</w:t>
+        <w:t xml:space="preserve"> Positive (+) aur Negative (-) </w:t>
+      </w:r>
+      <w:proofErr w:type="spellStart"/>
+      <w:r>
+        <w:t>dono</w:t>
+      </w:r>
+      <w:proofErr w:type="spellEnd"/>
+      <w:r>
+        <w:t xml:space="preserve"> numbers. Computer ko </w:t>
+      </w:r>
+      <w:proofErr w:type="spellStart"/>
+      <w:r>
+        <w:t>batana</w:t>
+      </w:r>
+      <w:proofErr w:type="spellEnd"/>
+      <w:r>
+        <w:t xml:space="preserve"> </w:t>
+      </w:r>
+      <w:proofErr w:type="spellStart"/>
+      <w:r>
+        <w:t>padta</w:t>
+      </w:r>
+      <w:proofErr w:type="spellEnd"/>
+      <w:r>
+        <w:t xml:space="preserve"> </w:t>
+      </w:r>
+      <w:proofErr w:type="spellStart"/>
+      <w:r>
+        <w:t>hai</w:t>
+      </w:r>
+      <w:proofErr w:type="spellEnd"/>
+      <w:r>
+        <w:t xml:space="preserve"> ki number negative </w:t>
+      </w:r>
+      <w:proofErr w:type="spellStart"/>
+      <w:r>
+        <w:t>hai</w:t>
+      </w:r>
+      <w:proofErr w:type="spellEnd"/>
+      <w:r>
+        <w:t xml:space="preserve"> </w:t>
+      </w:r>
+      <w:proofErr w:type="spellStart"/>
+      <w:r>
+        <w:t>ya</w:t>
+      </w:r>
+      <w:proofErr w:type="spellEnd"/>
+      <w:r>
+        <w:t xml:space="preserve"> </w:t>
+      </w:r>
+      <w:proofErr w:type="spellStart"/>
+      <w:r>
+        <w:t>nahi</w:t>
+      </w:r>
+      <w:proofErr w:type="spellEnd"/>
+      <w:r>
+        <w:t>.</w:t>
       </w:r>
     </w:p>
     <w:p>
@@ -1053,12 +2117,85 @@
           <w:b/>
           <w:bCs/>
         </w:rPr>
-        <w:t>2. Signed Representation ke Tareeke</w:t>
-      </w:r>
-    </w:p>
-    <w:p>
-      <w:r>
-        <w:t>Computer mein signed numbers ko dikhane ke liye 3 main tareeke (Representations) use hote hain:</w:t>
+        <w:t xml:space="preserve">2. Signed Representation </w:t>
+      </w:r>
+      <w:proofErr w:type="spellStart"/>
+      <w:r>
+        <w:rPr>
+          <w:b/>
+          <w:bCs/>
+        </w:rPr>
+        <w:t>ke</w:t>
+      </w:r>
+      <w:proofErr w:type="spellEnd"/>
+      <w:r>
+        <w:rPr>
+          <w:b/>
+          <w:bCs/>
+        </w:rPr>
+        <w:t xml:space="preserve"> </w:t>
+      </w:r>
+      <w:proofErr w:type="spellStart"/>
+      <w:r>
+        <w:rPr>
+          <w:b/>
+          <w:bCs/>
+        </w:rPr>
+        <w:t>Tareeke</w:t>
+      </w:r>
+      <w:proofErr w:type="spellEnd"/>
+    </w:p>
+    <w:p>
+      <w:r>
+        <w:t xml:space="preserve">Computer </w:t>
+      </w:r>
+      <w:proofErr w:type="spellStart"/>
+      <w:r>
+        <w:t>mein</w:t>
+      </w:r>
+      <w:proofErr w:type="spellEnd"/>
+      <w:r>
+        <w:t xml:space="preserve"> signed numbers ko </w:t>
+      </w:r>
+      <w:proofErr w:type="spellStart"/>
+      <w:r>
+        <w:t>dikhane</w:t>
+      </w:r>
+      <w:proofErr w:type="spellEnd"/>
+      <w:r>
+        <w:t xml:space="preserve"> </w:t>
+      </w:r>
+      <w:proofErr w:type="spellStart"/>
+      <w:r>
+        <w:t>ke</w:t>
+      </w:r>
+      <w:proofErr w:type="spellEnd"/>
+      <w:r>
+        <w:t xml:space="preserve"> </w:t>
+      </w:r>
+      <w:proofErr w:type="spellStart"/>
+      <w:r>
+        <w:t>liye</w:t>
+      </w:r>
+      <w:proofErr w:type="spellEnd"/>
+      <w:r>
+        <w:t xml:space="preserve"> 3 main </w:t>
+      </w:r>
+      <w:proofErr w:type="spellStart"/>
+      <w:r>
+        <w:t>tareeke</w:t>
+      </w:r>
+      <w:proofErr w:type="spellEnd"/>
+      <w:r>
+        <w:t xml:space="preserve"> (Representations) use </w:t>
+      </w:r>
+      <w:proofErr w:type="spellStart"/>
+      <w:r>
+        <w:t>hote</w:t>
+      </w:r>
+      <w:proofErr w:type="spellEnd"/>
+      <w:r>
+        <w:t xml:space="preserve"> hain:</w:t>
       </w:r>
     </w:p>
     <w:p>
@@ -1084,7 +2221,15 @@
         </w:numPr>
       </w:pPr>
       <w:r>
-        <w:t>Sabse purana aur simple tareeka.</w:t>
+        <w:t xml:space="preserve">Sabse purana aur simple </w:t>
+      </w:r>
+      <w:proofErr w:type="spellStart"/>
+      <w:r>
+        <w:t>tareeka</w:t>
+      </w:r>
+      <w:proofErr w:type="spellEnd"/>
+      <w:r>
+        <w:t>.</w:t>
       </w:r>
     </w:p>
     <w:p>
@@ -1097,15 +2242,72 @@
       <w:r>
         <w:t xml:space="preserve">Isme </w:t>
       </w:r>
-      <w:r>
-        <w:rPr>
-          <w:b/>
-          <w:bCs/>
-        </w:rPr>
-        <w:t>sabse pehli bit (MSB - Most Significant Bit)</w:t>
-      </w:r>
-      <w:r>
-        <w:t xml:space="preserve"> sign ke liye hoti hai.</w:t>
+      <w:proofErr w:type="spellStart"/>
+      <w:r>
+        <w:rPr>
+          <w:b/>
+          <w:bCs/>
+        </w:rPr>
+        <w:t>sabse</w:t>
+      </w:r>
+      <w:proofErr w:type="spellEnd"/>
+      <w:r>
+        <w:rPr>
+          <w:b/>
+          <w:bCs/>
+        </w:rPr>
+        <w:t xml:space="preserve"> </w:t>
+      </w:r>
+      <w:proofErr w:type="spellStart"/>
+      <w:r>
+        <w:rPr>
+          <w:b/>
+          <w:bCs/>
+        </w:rPr>
+        <w:t>pehli</w:t>
+      </w:r>
+      <w:proofErr w:type="spellEnd"/>
+      <w:r>
+        <w:rPr>
+          <w:b/>
+          <w:bCs/>
+        </w:rPr>
+        <w:t xml:space="preserve"> bit (MSB - Most Significant Bit)</w:t>
+      </w:r>
+      <w:r>
+        <w:t xml:space="preserve"> sign </w:t>
+      </w:r>
+      <w:proofErr w:type="spellStart"/>
+      <w:r>
+        <w:t>ke</w:t>
+      </w:r>
+      <w:proofErr w:type="spellEnd"/>
+      <w:r>
+        <w:t xml:space="preserve"> </w:t>
+      </w:r>
+      <w:proofErr w:type="spellStart"/>
+      <w:r>
+        <w:t>liye</w:t>
+      </w:r>
+      <w:proofErr w:type="spellEnd"/>
+      <w:r>
+        <w:t xml:space="preserve"> </w:t>
+      </w:r>
+      <w:proofErr w:type="spellStart"/>
+      <w:r>
+        <w:t>hoti</w:t>
+      </w:r>
+      <w:proofErr w:type="spellEnd"/>
+      <w:r>
+        <w:t xml:space="preserve"> </w:t>
+      </w:r>
+      <w:proofErr w:type="spellStart"/>
+      <w:r>
+        <w:t>hai</w:t>
+      </w:r>
+      <w:proofErr w:type="spellEnd"/>
+      <w:r>
+        <w:t>.</w:t>
       </w:r>
     </w:p>
     <w:p>
@@ -1116,7 +2318,15 @@
         </w:numPr>
       </w:pPr>
       <w:r>
-        <w:t>0 ka matlab Positive (+)</w:t>
+        <w:t xml:space="preserve">0 ka </w:t>
+      </w:r>
+      <w:proofErr w:type="spellStart"/>
+      <w:r>
+        <w:t>matlab</w:t>
+      </w:r>
+      <w:proofErr w:type="spellEnd"/>
+      <w:r>
+        <w:t xml:space="preserve"> Positive (+)</w:t>
       </w:r>
     </w:p>
     <w:p>
@@ -1128,7 +2338,15 @@
       </w:pPr>
       <w:r>
         <w:lastRenderedPageBreak/>
-        <w:t>1 ka matlab Negative (-)</w:t>
+        <w:t xml:space="preserve">1 ka </w:t>
+      </w:r>
+      <w:proofErr w:type="spellStart"/>
+      <w:r>
+        <w:t>matlab</w:t>
+      </w:r>
+      <w:proofErr w:type="spellEnd"/>
+      <w:r>
+        <w:t xml:space="preserve"> Negative (-)</w:t>
       </w:r>
     </w:p>
     <w:p>
@@ -1139,7 +2357,15 @@
         </w:numPr>
       </w:pPr>
       <w:r>
-        <w:t>Baki bits number ki value (magnitude) batati hain.</w:t>
+        <w:t xml:space="preserve">Baki bits number ki value (magnitude) </w:t>
+      </w:r>
+      <w:proofErr w:type="spellStart"/>
+      <w:r>
+        <w:t>batati</w:t>
+      </w:r>
+      <w:proofErr w:type="spellEnd"/>
+      <w:r>
+        <w:t xml:space="preserve"> hain.</w:t>
       </w:r>
     </w:p>
     <w:p>
@@ -1157,7 +2383,55 @@
         <w:t>Problem:</w:t>
       </w:r>
       <w:r>
-        <w:t xml:space="preserve"> Isme do tarah ke zero hote hain (+0 aur -0), jo math mein confusion paida karte hain.</w:t>
+        <w:t xml:space="preserve"> Isme do </w:t>
+      </w:r>
+      <w:proofErr w:type="spellStart"/>
+      <w:r>
+        <w:t>tarah</w:t>
+      </w:r>
+      <w:proofErr w:type="spellEnd"/>
+      <w:r>
+        <w:t xml:space="preserve"> </w:t>
+      </w:r>
+      <w:proofErr w:type="spellStart"/>
+      <w:r>
+        <w:t>ke</w:t>
+      </w:r>
+      <w:proofErr w:type="spellEnd"/>
+      <w:r>
+        <w:t xml:space="preserve"> zero </w:t>
+      </w:r>
+      <w:proofErr w:type="spellStart"/>
+      <w:r>
+        <w:t>hote</w:t>
+      </w:r>
+      <w:proofErr w:type="spellEnd"/>
+      <w:r>
+        <w:t xml:space="preserve"> hain (+0 aur -0), jo math </w:t>
+      </w:r>
+      <w:proofErr w:type="spellStart"/>
+      <w:r>
+        <w:t>mein</w:t>
+      </w:r>
+      <w:proofErr w:type="spellEnd"/>
+      <w:r>
+        <w:t xml:space="preserve"> confusion </w:t>
+      </w:r>
+      <w:proofErr w:type="spellStart"/>
+      <w:r>
+        <w:t>paida</w:t>
+      </w:r>
+      <w:proofErr w:type="spellEnd"/>
+      <w:r>
+        <w:t xml:space="preserve"> </w:t>
+      </w:r>
+      <w:proofErr w:type="spellStart"/>
+      <w:r>
+        <w:t>karte</w:t>
+      </w:r>
+      <w:proofErr w:type="spellEnd"/>
+      <w:r>
+        <w:t xml:space="preserve"> hain.</w:t>
       </w:r>
     </w:p>
     <w:p>
@@ -1183,7 +2457,39 @@
         </w:numPr>
       </w:pPr>
       <w:r>
-        <w:t xml:space="preserve">Isme negative number nikalne ke liye positive number ki saari bits ko </w:t>
+        <w:t xml:space="preserve">Isme negative number </w:t>
+      </w:r>
+      <w:proofErr w:type="spellStart"/>
+      <w:r>
+        <w:t>nikalne</w:t>
+      </w:r>
+      <w:proofErr w:type="spellEnd"/>
+      <w:r>
+        <w:t xml:space="preserve"> </w:t>
+      </w:r>
+      <w:proofErr w:type="spellStart"/>
+      <w:r>
+        <w:t>ke</w:t>
+      </w:r>
+      <w:proofErr w:type="spellEnd"/>
+      <w:r>
+        <w:t xml:space="preserve"> </w:t>
+      </w:r>
+      <w:proofErr w:type="spellStart"/>
+      <w:r>
+        <w:t>liye</w:t>
+      </w:r>
+      <w:proofErr w:type="spellEnd"/>
+      <w:r>
+        <w:t xml:space="preserve"> positive number ki </w:t>
+      </w:r>
+      <w:proofErr w:type="spellStart"/>
+      <w:r>
+        <w:t>saari</w:t>
+      </w:r>
+      <w:proofErr w:type="spellEnd"/>
+      <w:r>
+        <w:t xml:space="preserve"> bits ko </w:t>
       </w:r>
       <w:r>
         <w:rPr>
@@ -1193,7 +2499,31 @@
         <w:t>Flip</w:t>
       </w:r>
       <w:r>
-        <w:t xml:space="preserve"> (ulta) kar dete hain. (0 ko 1, aur 1 ko 0).</w:t>
+        <w:t xml:space="preserve"> (</w:t>
+      </w:r>
+      <w:proofErr w:type="spellStart"/>
+      <w:r>
+        <w:t>ulta</w:t>
+      </w:r>
+      <w:proofErr w:type="spellEnd"/>
+      <w:r>
+        <w:t xml:space="preserve">) </w:t>
+      </w:r>
+      <w:proofErr w:type="spellStart"/>
+      <w:r>
+        <w:t>kar</w:t>
+      </w:r>
+      <w:proofErr w:type="spellEnd"/>
+      <w:r>
+        <w:t xml:space="preserve"> </w:t>
+      </w:r>
+      <w:proofErr w:type="spellStart"/>
+      <w:r>
+        <w:t>dete</w:t>
+      </w:r>
+      <w:proofErr w:type="spellEnd"/>
+      <w:r>
+        <w:t xml:space="preserve"> hain. (0 ko 1, aur 1 ko 0).</w:t>
       </w:r>
     </w:p>
     <w:p>
@@ -1204,7 +2534,86 @@
         </w:numPr>
       </w:pPr>
       <w:r>
-        <w:t>Isme bhi do tarah ke zero (+0 aur -0) ki problem rehti hai.</w:t>
+        <w:t xml:space="preserve">Isme </w:t>
+      </w:r>
+      <w:proofErr w:type="spellStart"/>
+      <w:r>
+        <w:t>bhi</w:t>
+      </w:r>
+      <w:proofErr w:type="spellEnd"/>
+      <w:r>
+        <w:t xml:space="preserve"> do </w:t>
+      </w:r>
+      <w:proofErr w:type="spellStart"/>
+      <w:r>
+        <w:t>tarah</w:t>
+      </w:r>
+      <w:proofErr w:type="spellEnd"/>
+      <w:r>
+        <w:t xml:space="preserve"> </w:t>
+      </w:r>
+      <w:proofErr w:type="spellStart"/>
+      <w:r>
+        <w:t>ke</w:t>
+      </w:r>
+      <w:proofErr w:type="spellEnd"/>
+      <w:r>
+        <w:t xml:space="preserve"> zero (+0 aur -0) ki problem </w:t>
+      </w:r>
+      <w:proofErr w:type="spellStart"/>
+      <w:r>
+        <w:t>rehti</w:t>
+      </w:r>
+      <w:proofErr w:type="spellEnd"/>
+      <w:r>
+        <w:t xml:space="preserve"> </w:t>
+      </w:r>
+      <w:proofErr w:type="spellStart"/>
+      <w:r>
+        <w:t>hai</w:t>
+      </w:r>
+      <w:proofErr w:type="spellEnd"/>
+      <w:r>
+        <w:t>.</w:t>
+      </w:r>
+    </w:p>
+    <w:p>
+      <w:r>
+        <w:drawing>
+          <wp:inline distT="0" distB="0" distL="0" distR="0" wp14:anchorId="1D0AD230" wp14:editId="5DCDFB74">
+            <wp:extent cx="5731510" cy="2886075"/>
+            <wp:effectExtent l="0" t="0" r="2540" b="9525"/>
+            <wp:docPr id="261219599" name="Picture 1" descr="A whiteboard with blue writing&#10;&#10;AI-generated content may be incorrect."/>
+            <wp:cNvGraphicFramePr>
+              <a:graphicFrameLocks xmlns:a="http://schemas.openxmlformats.org/drawingml/2006/main" noChangeAspect="1"/>
+            </wp:cNvGraphicFramePr>
+            <a:graphic xmlns:a="http://schemas.openxmlformats.org/drawingml/2006/main">
+              <a:graphicData uri="http://schemas.openxmlformats.org/drawingml/2006/picture">
+                <pic:pic xmlns:pic="http://schemas.openxmlformats.org/drawingml/2006/picture">
+                  <pic:nvPicPr>
+                    <pic:cNvPr id="261219599" name="Picture 1" descr="A whiteboard with blue writing&#10;&#10;AI-generated content may be incorrect."/>
+                    <pic:cNvPicPr/>
+                  </pic:nvPicPr>
+                  <pic:blipFill>
+                    <a:blip r:embed="rId7"/>
+                    <a:stretch>
+                      <a:fillRect/>
+                    </a:stretch>
+                  </pic:blipFill>
+                  <pic:spPr>
+                    <a:xfrm>
+                      <a:off x="0" y="0"/>
+                      <a:ext cx="5731510" cy="2886075"/>
+                    </a:xfrm>
+                    <a:prstGeom prst="rect">
+                      <a:avLst/>
+                    </a:prstGeom>
+                  </pic:spPr>
+                </pic:pic>
+              </a:graphicData>
+            </a:graphic>
+          </wp:inline>
+        </w:drawing>
       </w:r>
     </w:p>
     <w:p>
@@ -1234,7 +2643,39 @@
           <w:b/>
           <w:bCs/>
         </w:rPr>
-        <w:t>Modern computers yahi use karte hain.</w:t>
+        <w:t xml:space="preserve">Modern computers </w:t>
+      </w:r>
+      <w:proofErr w:type="spellStart"/>
+      <w:r>
+        <w:rPr>
+          <w:b/>
+          <w:bCs/>
+        </w:rPr>
+        <w:t>yahi</w:t>
+      </w:r>
+      <w:proofErr w:type="spellEnd"/>
+      <w:r>
+        <w:rPr>
+          <w:b/>
+          <w:bCs/>
+        </w:rPr>
+        <w:t xml:space="preserve"> use </w:t>
+      </w:r>
+      <w:proofErr w:type="spellStart"/>
+      <w:r>
+        <w:rPr>
+          <w:b/>
+          <w:bCs/>
+        </w:rPr>
+        <w:t>karte</w:t>
+      </w:r>
+      <w:proofErr w:type="spellEnd"/>
+      <w:r>
+        <w:rPr>
+          <w:b/>
+          <w:bCs/>
+        </w:rPr>
+        <w:t xml:space="preserve"> hain.</w:t>
       </w:r>
     </w:p>
     <w:p>
@@ -1245,7 +2686,29 @@
         </w:numPr>
       </w:pPr>
       <w:r>
-        <w:t>Iska formula: $2's \text{ Complement} = (1's \text{ Complement}) + 1$.</w:t>
+        <w:t>Iska formula: 2's</w:t>
+      </w:r>
+      <w:r>
+        <w:t xml:space="preserve"> </w:t>
+      </w:r>
+      <w:proofErr w:type="gramStart"/>
+      <w:r>
+        <w:t>{ Complement</w:t>
+      </w:r>
+      <w:proofErr w:type="gramEnd"/>
+      <w:r>
+        <w:t>} = (1's</w:t>
+      </w:r>
+      <w:r>
+        <w:t xml:space="preserve"> </w:t>
+      </w:r>
+      <w:proofErr w:type="gramStart"/>
+      <w:r>
+        <w:t>{ Complement</w:t>
+      </w:r>
+      <w:proofErr w:type="gramEnd"/>
+      <w:r>
+        <w:t>}) + 1.</w:t>
       </w:r>
     </w:p>
     <w:p>
@@ -1256,10 +2719,191 @@
         </w:numPr>
       </w:pPr>
       <w:r>
-        <w:t>Iska sabse bada fayda ye hai ki isme zero sirf ek hi hota hai, aur computer math (Addition/Subtraction) bohot aasaani se kar leta hai.</w:t>
-      </w:r>
-    </w:p>
-    <w:p>
+        <w:t xml:space="preserve">Iska </w:t>
+      </w:r>
+      <w:proofErr w:type="spellStart"/>
+      <w:r>
+        <w:t>sabse</w:t>
+      </w:r>
+      <w:proofErr w:type="spellEnd"/>
+      <w:r>
+        <w:t xml:space="preserve"> </w:t>
+      </w:r>
+      <w:proofErr w:type="spellStart"/>
+      <w:r>
+        <w:t>bada</w:t>
+      </w:r>
+      <w:proofErr w:type="spellEnd"/>
+      <w:r>
+        <w:t xml:space="preserve"> </w:t>
+      </w:r>
+      <w:proofErr w:type="spellStart"/>
+      <w:r>
+        <w:t>fayda</w:t>
+      </w:r>
+      <w:proofErr w:type="spellEnd"/>
+      <w:r>
+        <w:t xml:space="preserve"> ye </w:t>
+      </w:r>
+      <w:proofErr w:type="spellStart"/>
+      <w:r>
+        <w:t>hai</w:t>
+      </w:r>
+      <w:proofErr w:type="spellEnd"/>
+      <w:r>
+        <w:t xml:space="preserve"> ki </w:t>
+      </w:r>
+      <w:proofErr w:type="spellStart"/>
+      <w:r>
+        <w:t>isme</w:t>
+      </w:r>
+      <w:proofErr w:type="spellEnd"/>
+      <w:r>
+        <w:t xml:space="preserve"> zero </w:t>
+      </w:r>
+      <w:proofErr w:type="spellStart"/>
+      <w:r>
+        <w:t>sirf</w:t>
+      </w:r>
+      <w:proofErr w:type="spellEnd"/>
+      <w:r>
+        <w:t xml:space="preserve"> ek hi </w:t>
+      </w:r>
+      <w:proofErr w:type="spellStart"/>
+      <w:r>
+        <w:t>hota</w:t>
+      </w:r>
+      <w:proofErr w:type="spellEnd"/>
+      <w:r>
+        <w:t xml:space="preserve"> </w:t>
+      </w:r>
+      <w:proofErr w:type="spellStart"/>
+      <w:r>
+        <w:t>hai</w:t>
+      </w:r>
+      <w:proofErr w:type="spellEnd"/>
+      <w:r>
+        <w:t xml:space="preserve">, aur computer math (Addition/Subtraction) </w:t>
+      </w:r>
+      <w:proofErr w:type="spellStart"/>
+      <w:r>
+        <w:t>bohot</w:t>
+      </w:r>
+      <w:proofErr w:type="spellEnd"/>
+      <w:r>
+        <w:t xml:space="preserve"> </w:t>
+      </w:r>
+      <w:proofErr w:type="spellStart"/>
+      <w:r>
+        <w:t>aasaani</w:t>
+      </w:r>
+      <w:proofErr w:type="spellEnd"/>
+      <w:r>
+        <w:t xml:space="preserve"> se </w:t>
+      </w:r>
+      <w:proofErr w:type="spellStart"/>
+      <w:r>
+        <w:t>kar</w:t>
+      </w:r>
+      <w:proofErr w:type="spellEnd"/>
+      <w:r>
+        <w:t xml:space="preserve"> </w:t>
+      </w:r>
+      <w:proofErr w:type="spellStart"/>
+      <w:r>
+        <w:t>leta</w:t>
+      </w:r>
+      <w:proofErr w:type="spellEnd"/>
+      <w:r>
+        <w:t xml:space="preserve"> </w:t>
+      </w:r>
+      <w:proofErr w:type="spellStart"/>
+      <w:r>
+        <w:t>hai</w:t>
+      </w:r>
+      <w:proofErr w:type="spellEnd"/>
+      <w:r>
+        <w:t>.</w:t>
+      </w:r>
+    </w:p>
+    <w:p>
+      <w:r>
+        <w:lastRenderedPageBreak/>
+        <w:drawing>
+          <wp:inline distT="0" distB="0" distL="0" distR="0" wp14:anchorId="38823638" wp14:editId="1852DA24">
+            <wp:extent cx="5731510" cy="2710180"/>
+            <wp:effectExtent l="0" t="0" r="2540" b="0"/>
+            <wp:docPr id="1645908605" name="Picture 1" descr="A whiteboard with red writing and a number of numbers&#10;&#10;AI-generated content may be incorrect."/>
+            <wp:cNvGraphicFramePr>
+              <a:graphicFrameLocks xmlns:a="http://schemas.openxmlformats.org/drawingml/2006/main" noChangeAspect="1"/>
+            </wp:cNvGraphicFramePr>
+            <a:graphic xmlns:a="http://schemas.openxmlformats.org/drawingml/2006/main">
+              <a:graphicData uri="http://schemas.openxmlformats.org/drawingml/2006/picture">
+                <pic:pic xmlns:pic="http://schemas.openxmlformats.org/drawingml/2006/picture">
+                  <pic:nvPicPr>
+                    <pic:cNvPr id="1645908605" name="Picture 1" descr="A whiteboard with red writing and a number of numbers&#10;&#10;AI-generated content may be incorrect."/>
+                    <pic:cNvPicPr/>
+                  </pic:nvPicPr>
+                  <pic:blipFill>
+                    <a:blip r:embed="rId8"/>
+                    <a:stretch>
+                      <a:fillRect/>
+                    </a:stretch>
+                  </pic:blipFill>
+                  <pic:spPr>
+                    <a:xfrm>
+                      <a:off x="0" y="0"/>
+                      <a:ext cx="5731510" cy="2710180"/>
+                    </a:xfrm>
+                    <a:prstGeom prst="rect">
+                      <a:avLst/>
+                    </a:prstGeom>
+                  </pic:spPr>
+                </pic:pic>
+              </a:graphicData>
+            </a:graphic>
+          </wp:inline>
+        </w:drawing>
+      </w:r>
+    </w:p>
+    <w:p>
+      <w:r>
+        <w:drawing>
+          <wp:inline distT="0" distB="0" distL="0" distR="0" wp14:anchorId="71492761" wp14:editId="3401BD81">
+            <wp:extent cx="5731510" cy="1929130"/>
+            <wp:effectExtent l="0" t="0" r="2540" b="0"/>
+            <wp:docPr id="398305891" name="Picture 1" descr="A white board with blue writing&#10;&#10;AI-generated content may be incorrect."/>
+            <wp:cNvGraphicFramePr>
+              <a:graphicFrameLocks xmlns:a="http://schemas.openxmlformats.org/drawingml/2006/main" noChangeAspect="1"/>
+            </wp:cNvGraphicFramePr>
+            <a:graphic xmlns:a="http://schemas.openxmlformats.org/drawingml/2006/main">
+              <a:graphicData uri="http://schemas.openxmlformats.org/drawingml/2006/picture">
+                <pic:pic xmlns:pic="http://schemas.openxmlformats.org/drawingml/2006/picture">
+                  <pic:nvPicPr>
+                    <pic:cNvPr id="398305891" name="Picture 1" descr="A white board with blue writing&#10;&#10;AI-generated content may be incorrect."/>
+                    <pic:cNvPicPr/>
+                  </pic:nvPicPr>
+                  <pic:blipFill>
+                    <a:blip r:embed="rId9"/>
+                    <a:stretch>
+                      <a:fillRect/>
+                    </a:stretch>
+                  </pic:blipFill>
+                  <pic:spPr>
+                    <a:xfrm>
+                      <a:off x="0" y="0"/>
+                      <a:ext cx="5731510" cy="1929130"/>
+                    </a:xfrm>
+                    <a:prstGeom prst="rect">
+                      <a:avLst/>
+                    </a:prstGeom>
+                  </pic:spPr>
+                </pic:pic>
+              </a:graphicData>
+            </a:graphic>
+          </wp:inline>
+        </w:drawing>
+      </w:r>
       <w:r>
         <w:pict w14:anchorId="53FE812B">
           <v:rect id="_x0000_i1091" style="width:0;height:1.5pt" o:hralign="center" o:hrstd="t" o:hr="t" fillcolor="#a0a0a0" stroked="f"/>
@@ -1289,7 +2933,31 @@
         </w:numPr>
       </w:pPr>
       <w:r>
-        <w:t>Agar hum 8-bit memory use kar rahe hain, toh:</w:t>
+        <w:t xml:space="preserve">Agar hum 8-bit memory use </w:t>
+      </w:r>
+      <w:proofErr w:type="spellStart"/>
+      <w:r>
+        <w:t>kar</w:t>
+      </w:r>
+      <w:proofErr w:type="spellEnd"/>
+      <w:r>
+        <w:t xml:space="preserve"> </w:t>
+      </w:r>
+      <w:proofErr w:type="spellStart"/>
+      <w:r>
+        <w:t>rahe</w:t>
+      </w:r>
+      <w:proofErr w:type="spellEnd"/>
+      <w:r>
+        <w:t xml:space="preserve"> hain, </w:t>
+      </w:r>
+      <w:proofErr w:type="spellStart"/>
+      <w:r>
+        <w:t>toh</w:t>
+      </w:r>
+      <w:proofErr w:type="spellEnd"/>
+      <w:r>
+        <w:t>:</w:t>
       </w:r>
     </w:p>
     <w:p>
@@ -1307,7 +2975,39 @@
         <w:t>7 bits</w:t>
       </w:r>
       <w:r>
-        <w:t xml:space="preserve"> number store karne ke liye bachti hain.</w:t>
+        <w:t xml:space="preserve"> number store </w:t>
+      </w:r>
+      <w:proofErr w:type="spellStart"/>
+      <w:r>
+        <w:t>karne</w:t>
+      </w:r>
+      <w:proofErr w:type="spellEnd"/>
+      <w:r>
+        <w:t xml:space="preserve"> </w:t>
+      </w:r>
+      <w:proofErr w:type="spellStart"/>
+      <w:r>
+        <w:t>ke</w:t>
+      </w:r>
+      <w:proofErr w:type="spellEnd"/>
+      <w:r>
+        <w:t xml:space="preserve"> </w:t>
+      </w:r>
+      <w:proofErr w:type="spellStart"/>
+      <w:r>
+        <w:t>liye</w:t>
+      </w:r>
+      <w:proofErr w:type="spellEnd"/>
+      <w:r>
+        <w:t xml:space="preserve"> </w:t>
+      </w:r>
+      <w:proofErr w:type="spellStart"/>
+      <w:r>
+        <w:t>bachti</w:t>
+      </w:r>
+      <w:proofErr w:type="spellEnd"/>
+      <w:r>
+        <w:t xml:space="preserve"> hain.</w:t>
       </w:r>
     </w:p>
     <w:p>
@@ -1317,15 +3017,56 @@
           <w:numId w:val="7"/>
         </w:numPr>
       </w:pPr>
-      <w:r>
-        <w:rPr>
-          <w:b/>
-          <w:bCs/>
-        </w:rPr>
-        <w:t>1 bit (MSB)</w:t>
-      </w:r>
-      <w:r>
-        <w:t xml:space="preserve"> ye batati hai ki number sign kya hai.</w:t>
+      <w:proofErr w:type="gramStart"/>
+      <w:r>
+        <w:rPr>
+          <w:b/>
+          <w:bCs/>
+        </w:rPr>
+        <w:t>1 bit</w:t>
+      </w:r>
+      <w:proofErr w:type="gramEnd"/>
+      <w:r>
+        <w:rPr>
+          <w:b/>
+          <w:bCs/>
+        </w:rPr>
+        <w:t xml:space="preserve"> (MSB)</w:t>
+      </w:r>
+      <w:r>
+        <w:t xml:space="preserve"> ye </w:t>
+      </w:r>
+      <w:proofErr w:type="spellStart"/>
+      <w:r>
+        <w:t>batati</w:t>
+      </w:r>
+      <w:proofErr w:type="spellEnd"/>
+      <w:r>
+        <w:t xml:space="preserve"> </w:t>
+      </w:r>
+      <w:proofErr w:type="spellStart"/>
+      <w:r>
+        <w:t>hai</w:t>
+      </w:r>
+      <w:proofErr w:type="spellEnd"/>
+      <w:r>
+        <w:t xml:space="preserve"> ki number sign </w:t>
+      </w:r>
+      <w:proofErr w:type="spellStart"/>
+      <w:r>
+        <w:t>kya</w:t>
+      </w:r>
+      <w:proofErr w:type="spellEnd"/>
+      <w:r>
+        <w:t xml:space="preserve"> </w:t>
+      </w:r>
+      <w:proofErr w:type="spellStart"/>
+      <w:r>
+        <w:t>hai</w:t>
+      </w:r>
+      <w:proofErr w:type="spellEnd"/>
+      <w:r>
+        <w:t>.</w:t>
       </w:r>
     </w:p>
     <w:p>
@@ -1343,7 +3084,23 @@
         <w:t>Formula for Range:</w:t>
       </w:r>
       <w:r>
-        <w:t xml:space="preserve"> Agar tumhare paas n bits hain:</w:t>
+        <w:t xml:space="preserve"> Agar </w:t>
+      </w:r>
+      <w:proofErr w:type="spellStart"/>
+      <w:r>
+        <w:t>tumhare</w:t>
+      </w:r>
+      <w:proofErr w:type="spellEnd"/>
+      <w:r>
+        <w:t xml:space="preserve"> </w:t>
+      </w:r>
+      <w:proofErr w:type="spellStart"/>
+      <w:r>
+        <w:t>paas</w:t>
+      </w:r>
+      <w:proofErr w:type="spellEnd"/>
+      <w:r>
+        <w:t xml:space="preserve"> n bits hain:</w:t>
       </w:r>
     </w:p>
     <w:p>
@@ -1365,10 +3122,59 @@
         </w:numPr>
       </w:pPr>
       <w:r>
-        <w:t>Signed ki range (approx): -2^{n-1} se +2^{n-1} - 1.</w:t>
-      </w:r>
-    </w:p>
-    <w:p>
+        <w:t>Signed ki range (</w:t>
+      </w:r>
+      <w:proofErr w:type="spellStart"/>
+      <w:r>
+        <w:t>approx</w:t>
+      </w:r>
+      <w:proofErr w:type="spellEnd"/>
+      <w:r>
+        <w:t>): -2^{n-1} se +2^{n-1} - 1.</w:t>
+      </w:r>
+    </w:p>
+    <w:p>
+      <w:r>
+        <w:lastRenderedPageBreak/>
+        <w:t xml:space="preserve">                       </w:t>
+      </w:r>
+      <w:r>
+        <w:drawing>
+          <wp:inline distT="0" distB="0" distL="0" distR="0" wp14:anchorId="6DE7B930" wp14:editId="6DB866B6">
+            <wp:extent cx="4048690" cy="3781953"/>
+            <wp:effectExtent l="0" t="0" r="9525" b="9525"/>
+            <wp:docPr id="2116877211" name="Picture 1"/>
+            <wp:cNvGraphicFramePr>
+              <a:graphicFrameLocks xmlns:a="http://schemas.openxmlformats.org/drawingml/2006/main" noChangeAspect="1"/>
+            </wp:cNvGraphicFramePr>
+            <a:graphic xmlns:a="http://schemas.openxmlformats.org/drawingml/2006/main">
+              <a:graphicData uri="http://schemas.openxmlformats.org/drawingml/2006/picture">
+                <pic:pic xmlns:pic="http://schemas.openxmlformats.org/drawingml/2006/picture">
+                  <pic:nvPicPr>
+                    <pic:cNvPr id="2116877211" name=""/>
+                    <pic:cNvPicPr/>
+                  </pic:nvPicPr>
+                  <pic:blipFill>
+                    <a:blip r:embed="rId10"/>
+                    <a:stretch>
+                      <a:fillRect/>
+                    </a:stretch>
+                  </pic:blipFill>
+                  <pic:spPr>
+                    <a:xfrm>
+                      <a:off x="0" y="0"/>
+                      <a:ext cx="4048690" cy="3781953"/>
+                    </a:xfrm>
+                    <a:prstGeom prst="rect">
+                      <a:avLst/>
+                    </a:prstGeom>
+                  </pic:spPr>
+                </pic:pic>
+              </a:graphicData>
+            </a:graphic>
+          </wp:inline>
+        </w:drawing>
+      </w:r>
       <w:r>
         <w:pict w14:anchorId="65AE3160">
           <v:rect id="_x0000_i1092" style="width:0;height:1.5pt" o:hralign="center" o:hrstd="t" o:hr="t" fillcolor="#a0a0a0" stroked="f"/>
@@ -1387,24 +3193,168 @@
           <w:b/>
           <w:bCs/>
         </w:rPr>
-        <w:t>4. Ek Solid Rule (Jo sir ne bataya)</w:t>
-      </w:r>
-    </w:p>
-    <w:p>
-      <w:r>
-        <w:t xml:space="preserve">Video mein ek bohot bada point hai: </w:t>
-      </w:r>
-      <w:r>
-        <w:rPr>
-          <w:b/>
-          <w:bCs/>
-        </w:rPr>
-        <w:t>"Positive numbers ke liye teeno representations (SMR, 1's, aur 2's complement) ekdum SAME hote hain."</w:t>
-      </w:r>
-    </w:p>
-    <w:p>
-      <w:r>
-        <w:t xml:space="preserve">Khel tab badalta hai jab number </w:t>
+        <w:t xml:space="preserve">4. Ek Solid Rule (Jo sir ne </w:t>
+      </w:r>
+      <w:proofErr w:type="spellStart"/>
+      <w:r>
+        <w:rPr>
+          <w:b/>
+          <w:bCs/>
+        </w:rPr>
+        <w:t>bataya</w:t>
+      </w:r>
+      <w:proofErr w:type="spellEnd"/>
+      <w:r>
+        <w:rPr>
+          <w:b/>
+          <w:bCs/>
+        </w:rPr>
+        <w:t>)</w:t>
+      </w:r>
+    </w:p>
+    <w:p>
+      <w:r>
+        <w:t xml:space="preserve">Video </w:t>
+      </w:r>
+      <w:proofErr w:type="spellStart"/>
+      <w:r>
+        <w:t>mein</w:t>
+      </w:r>
+      <w:proofErr w:type="spellEnd"/>
+      <w:r>
+        <w:t xml:space="preserve"> ek </w:t>
+      </w:r>
+      <w:proofErr w:type="spellStart"/>
+      <w:r>
+        <w:t>bohot</w:t>
+      </w:r>
+      <w:proofErr w:type="spellEnd"/>
+      <w:r>
+        <w:t xml:space="preserve"> </w:t>
+      </w:r>
+      <w:proofErr w:type="spellStart"/>
+      <w:r>
+        <w:t>bada</w:t>
+      </w:r>
+      <w:proofErr w:type="spellEnd"/>
+      <w:r>
+        <w:t xml:space="preserve"> point </w:t>
+      </w:r>
+      <w:proofErr w:type="spellStart"/>
+      <w:r>
+        <w:t>hai</w:t>
+      </w:r>
+      <w:proofErr w:type="spellEnd"/>
+      <w:r>
+        <w:t xml:space="preserve">: </w:t>
+      </w:r>
+      <w:r>
+        <w:rPr>
+          <w:b/>
+          <w:bCs/>
+        </w:rPr>
+        <w:t xml:space="preserve">"Positive numbers </w:t>
+      </w:r>
+      <w:proofErr w:type="spellStart"/>
+      <w:r>
+        <w:rPr>
+          <w:b/>
+          <w:bCs/>
+        </w:rPr>
+        <w:t>ke</w:t>
+      </w:r>
+      <w:proofErr w:type="spellEnd"/>
+      <w:r>
+        <w:rPr>
+          <w:b/>
+          <w:bCs/>
+        </w:rPr>
+        <w:t xml:space="preserve"> </w:t>
+      </w:r>
+      <w:proofErr w:type="spellStart"/>
+      <w:r>
+        <w:rPr>
+          <w:b/>
+          <w:bCs/>
+        </w:rPr>
+        <w:t>liye</w:t>
+      </w:r>
+      <w:proofErr w:type="spellEnd"/>
+      <w:r>
+        <w:rPr>
+          <w:b/>
+          <w:bCs/>
+        </w:rPr>
+        <w:t xml:space="preserve"> </w:t>
+      </w:r>
+      <w:proofErr w:type="spellStart"/>
+      <w:r>
+        <w:rPr>
+          <w:b/>
+          <w:bCs/>
+        </w:rPr>
+        <w:t>teeno</w:t>
+      </w:r>
+      <w:proofErr w:type="spellEnd"/>
+      <w:r>
+        <w:rPr>
+          <w:b/>
+          <w:bCs/>
+        </w:rPr>
+        <w:t xml:space="preserve"> representations (SMR, 1's, aur 2's complement) </w:t>
+      </w:r>
+      <w:proofErr w:type="spellStart"/>
+      <w:r>
+        <w:rPr>
+          <w:b/>
+          <w:bCs/>
+        </w:rPr>
+        <w:t>ekdum</w:t>
+      </w:r>
+      <w:proofErr w:type="spellEnd"/>
+      <w:r>
+        <w:rPr>
+          <w:b/>
+          <w:bCs/>
+        </w:rPr>
+        <w:t xml:space="preserve"> SAME </w:t>
+      </w:r>
+      <w:proofErr w:type="spellStart"/>
+      <w:r>
+        <w:rPr>
+          <w:b/>
+          <w:bCs/>
+        </w:rPr>
+        <w:t>hote</w:t>
+      </w:r>
+      <w:proofErr w:type="spellEnd"/>
+      <w:r>
+        <w:rPr>
+          <w:b/>
+          <w:bCs/>
+        </w:rPr>
+        <w:t xml:space="preserve"> hain."</w:t>
+      </w:r>
+    </w:p>
+    <w:p>
+      <w:r>
+        <w:t xml:space="preserve">Khel tab </w:t>
+      </w:r>
+      <w:proofErr w:type="spellStart"/>
+      <w:r>
+        <w:t>badalta</w:t>
+      </w:r>
+      <w:proofErr w:type="spellEnd"/>
+      <w:r>
+        <w:t xml:space="preserve"> </w:t>
+      </w:r>
+      <w:proofErr w:type="spellStart"/>
+      <w:r>
+        <w:t>hai</w:t>
+      </w:r>
+      <w:proofErr w:type="spellEnd"/>
+      <w:r>
+        <w:t xml:space="preserve"> jab number </w:t>
       </w:r>
       <w:r>
         <w:rPr>
@@ -1414,7 +3364,31 @@
         <w:t>Negative</w:t>
       </w:r>
       <w:r>
-        <w:t xml:space="preserve"> ho jata hai.</w:t>
+        <w:t xml:space="preserve"> </w:t>
+      </w:r>
+      <w:proofErr w:type="spellStart"/>
+      <w:r>
+        <w:t>ho</w:t>
+      </w:r>
+      <w:proofErr w:type="spellEnd"/>
+      <w:r>
+        <w:t xml:space="preserve"> </w:t>
+      </w:r>
+      <w:proofErr w:type="spellStart"/>
+      <w:r>
+        <w:t>jata</w:t>
+      </w:r>
+      <w:proofErr w:type="spellEnd"/>
+      <w:r>
+        <w:t xml:space="preserve"> </w:t>
+      </w:r>
+      <w:proofErr w:type="spellStart"/>
+      <w:r>
+        <w:t>hai</w:t>
+      </w:r>
+      <w:proofErr w:type="spellEnd"/>
+      <w:r>
+        <w:t>.</w:t>
       </w:r>
       <w:r>
         <w:pict w14:anchorId="66A91926">
@@ -1478,7 +3452,6 @@
                 <w:b/>
                 <w:bCs/>
               </w:rPr>
-              <w:lastRenderedPageBreak/>
               <w:t>Representation</w:t>
             </w:r>
           </w:p>
@@ -1801,6 +3774,1484 @@
         </w:pict>
       </w:r>
     </w:p>
+    <w:p>
+      <w:pPr>
+        <w:rPr>
+          <w:b/>
+          <w:bCs/>
+          <w:sz w:val="36"/>
+          <w:szCs w:val="36"/>
+          <w:u w:val="single"/>
+        </w:rPr>
+      </w:pPr>
+      <w:r>
+        <w:rPr>
+          <w:b/>
+          <w:bCs/>
+          <w:sz w:val="36"/>
+          <w:szCs w:val="36"/>
+          <w:u w:val="single"/>
+        </w:rPr>
+        <w:t>C++ EXTRA NOTES (DATATYPES STORAGE FORMATS) (</w:t>
+      </w:r>
+      <w:r>
+        <w:rPr>
+          <w:b/>
+          <w:bCs/>
+          <w:sz w:val="36"/>
+          <w:szCs w:val="36"/>
+          <w:u w:val="single"/>
+        </w:rPr>
+        <w:t>3</w:t>
+      </w:r>
+      <w:r>
+        <w:rPr>
+          <w:b/>
+          <w:bCs/>
+          <w:sz w:val="36"/>
+          <w:szCs w:val="36"/>
+          <w:u w:val="single"/>
+        </w:rPr>
+        <w:t>)</w:t>
+      </w:r>
+    </w:p>
+    <w:p>
+      <w:pPr>
+        <w:rPr>
+          <w:b/>
+          <w:bCs/>
+        </w:rPr>
+      </w:pPr>
+      <w:r>
+        <w:rPr>
+          <w:b/>
+          <w:bCs/>
+        </w:rPr>
+        <w:t>1. 1's Complement Representation (Negative Numbers)</w:t>
+      </w:r>
+    </w:p>
+    <w:p>
+      <w:r>
+        <w:t xml:space="preserve">Jab </w:t>
+      </w:r>
+      <w:proofErr w:type="spellStart"/>
+      <w:r>
+        <w:t>humein</w:t>
+      </w:r>
+      <w:proofErr w:type="spellEnd"/>
+      <w:r>
+        <w:t xml:space="preserve"> </w:t>
+      </w:r>
+      <w:proofErr w:type="spellStart"/>
+      <w:r>
+        <w:t>kisi</w:t>
+      </w:r>
+      <w:proofErr w:type="spellEnd"/>
+      <w:r>
+        <w:t xml:space="preserve"> negative number (</w:t>
+      </w:r>
+      <w:proofErr w:type="spellStart"/>
+      <w:r>
+        <w:t>jaise</w:t>
+      </w:r>
+      <w:proofErr w:type="spellEnd"/>
+      <w:r>
+        <w:t xml:space="preserve"> -5) ko memory </w:t>
+      </w:r>
+      <w:proofErr w:type="spellStart"/>
+      <w:r>
+        <w:t>mein</w:t>
+      </w:r>
+      <w:proofErr w:type="spellEnd"/>
+      <w:r>
+        <w:t xml:space="preserve"> store </w:t>
+      </w:r>
+      <w:proofErr w:type="spellStart"/>
+      <w:r>
+        <w:t>karna</w:t>
+      </w:r>
+      <w:proofErr w:type="spellEnd"/>
+      <w:r>
+        <w:t xml:space="preserve"> </w:t>
+      </w:r>
+      <w:proofErr w:type="spellStart"/>
+      <w:r>
+        <w:t>hota</w:t>
+      </w:r>
+      <w:proofErr w:type="spellEnd"/>
+      <w:r>
+        <w:t xml:space="preserve"> </w:t>
+      </w:r>
+      <w:proofErr w:type="spellStart"/>
+      <w:r>
+        <w:t>hai</w:t>
+      </w:r>
+      <w:proofErr w:type="spellEnd"/>
+      <w:r>
+        <w:t xml:space="preserve"> using 1's complement, </w:t>
+      </w:r>
+      <w:proofErr w:type="spellStart"/>
+      <w:r>
+        <w:t>toh</w:t>
+      </w:r>
+      <w:proofErr w:type="spellEnd"/>
+      <w:r>
+        <w:t xml:space="preserve"> </w:t>
+      </w:r>
+      <w:proofErr w:type="spellStart"/>
+      <w:r>
+        <w:t>uske</w:t>
+      </w:r>
+      <w:proofErr w:type="spellEnd"/>
+      <w:r>
+        <w:t xml:space="preserve"> </w:t>
+      </w:r>
+      <w:proofErr w:type="spellStart"/>
+      <w:r>
+        <w:t>kuch</w:t>
+      </w:r>
+      <w:proofErr w:type="spellEnd"/>
+      <w:r>
+        <w:t xml:space="preserve"> steps </w:t>
+      </w:r>
+      <w:proofErr w:type="spellStart"/>
+      <w:r>
+        <w:t>hote</w:t>
+      </w:r>
+      <w:proofErr w:type="spellEnd"/>
+      <w:r>
+        <w:t xml:space="preserve"> hain:</w:t>
+      </w:r>
+    </w:p>
+    <w:p>
+      <w:r>
+        <w:rPr>
+          <w:b/>
+          <w:bCs/>
+        </w:rPr>
+        <w:lastRenderedPageBreak/>
+        <w:t>Steps to represent a negative number:</w:t>
+      </w:r>
+    </w:p>
+    <w:p>
+      <w:pPr>
+        <w:numPr>
+          <w:ilvl w:val="0"/>
+          <w:numId w:val="8"/>
+        </w:numPr>
+      </w:pPr>
+      <w:r>
+        <w:rPr>
+          <w:b/>
+          <w:bCs/>
+        </w:rPr>
+        <w:t>Positive Magnitude:</w:t>
+      </w:r>
+      <w:r>
+        <w:t xml:space="preserve"> Pehle us number ka positive binary </w:t>
+      </w:r>
+      <w:proofErr w:type="spellStart"/>
+      <w:r>
+        <w:t>nikalo</w:t>
+      </w:r>
+      <w:proofErr w:type="spellEnd"/>
+      <w:r>
+        <w:t xml:space="preserve"> (</w:t>
+      </w:r>
+      <w:proofErr w:type="spellStart"/>
+      <w:r>
+        <w:t>jaise</w:t>
+      </w:r>
+      <w:proofErr w:type="spellEnd"/>
+      <w:r>
+        <w:t xml:space="preserve"> +5 ka binary).</w:t>
+      </w:r>
+    </w:p>
+    <w:p>
+      <w:pPr>
+        <w:numPr>
+          <w:ilvl w:val="0"/>
+          <w:numId w:val="8"/>
+        </w:numPr>
+      </w:pPr>
+      <w:r>
+        <w:rPr>
+          <w:b/>
+          <w:bCs/>
+        </w:rPr>
+        <w:t>Bit Scaling:</w:t>
+      </w:r>
+      <w:r>
+        <w:t xml:space="preserve"> Use di </w:t>
+      </w:r>
+      <w:proofErr w:type="spellStart"/>
+      <w:r>
+        <w:t>gayi</w:t>
+      </w:r>
+      <w:proofErr w:type="spellEnd"/>
+      <w:r>
+        <w:t xml:space="preserve"> bits (</w:t>
+      </w:r>
+      <w:proofErr w:type="spellStart"/>
+      <w:r>
+        <w:t>jaise</w:t>
+      </w:r>
+      <w:proofErr w:type="spellEnd"/>
+      <w:r>
+        <w:t xml:space="preserve"> 8-bit </w:t>
+      </w:r>
+      <w:proofErr w:type="spellStart"/>
+      <w:r>
+        <w:t>ya</w:t>
+      </w:r>
+      <w:proofErr w:type="spellEnd"/>
+      <w:r>
+        <w:t xml:space="preserve"> 16-bit) </w:t>
+      </w:r>
+      <w:proofErr w:type="spellStart"/>
+      <w:r>
+        <w:t>mein</w:t>
+      </w:r>
+      <w:proofErr w:type="spellEnd"/>
+      <w:r>
+        <w:t xml:space="preserve"> convert karo (</w:t>
+      </w:r>
+      <w:proofErr w:type="spellStart"/>
+      <w:r>
+        <w:t>agey</w:t>
+      </w:r>
+      <w:proofErr w:type="spellEnd"/>
+      <w:r>
+        <w:t xml:space="preserve"> 0s </w:t>
+      </w:r>
+      <w:proofErr w:type="spellStart"/>
+      <w:r>
+        <w:t>laga</w:t>
+      </w:r>
+      <w:proofErr w:type="spellEnd"/>
+      <w:r>
+        <w:t xml:space="preserve"> </w:t>
+      </w:r>
+      <w:proofErr w:type="spellStart"/>
+      <w:r>
+        <w:t>kar</w:t>
+      </w:r>
+      <w:proofErr w:type="spellEnd"/>
+      <w:r>
+        <w:t>).</w:t>
+      </w:r>
+    </w:p>
+    <w:p>
+      <w:pPr>
+        <w:numPr>
+          <w:ilvl w:val="0"/>
+          <w:numId w:val="8"/>
+        </w:numPr>
+      </w:pPr>
+      <w:r>
+        <w:rPr>
+          <w:b/>
+          <w:bCs/>
+        </w:rPr>
+        <w:t>Flip the Bits:</w:t>
+      </w:r>
+      <w:r>
+        <w:t xml:space="preserve"> Ab </w:t>
+      </w:r>
+      <w:proofErr w:type="spellStart"/>
+      <w:r>
+        <w:t>saari</w:t>
+      </w:r>
+      <w:proofErr w:type="spellEnd"/>
+      <w:r>
+        <w:t xml:space="preserve"> bits ko </w:t>
+      </w:r>
+      <w:proofErr w:type="spellStart"/>
+      <w:r>
+        <w:t>ulta</w:t>
+      </w:r>
+      <w:proofErr w:type="spellEnd"/>
+      <w:r>
+        <w:t xml:space="preserve"> </w:t>
+      </w:r>
+      <w:proofErr w:type="spellStart"/>
+      <w:r>
+        <w:t>kar</w:t>
+      </w:r>
+      <w:proofErr w:type="spellEnd"/>
+      <w:r>
+        <w:t xml:space="preserve"> do (0 ko 1, aur 1 ko 0).</w:t>
+      </w:r>
+    </w:p>
+    <w:p>
+      <w:r>
+        <w:rPr>
+          <w:b/>
+          <w:bCs/>
+        </w:rPr>
+        <w:t>Example (-5 in 8-bit):</w:t>
+      </w:r>
+    </w:p>
+    <w:p>
+      <w:pPr>
+        <w:numPr>
+          <w:ilvl w:val="0"/>
+          <w:numId w:val="9"/>
+        </w:numPr>
+      </w:pPr>
+      <w:r>
+        <w:t>+5 binary: 00000101</w:t>
+      </w:r>
+    </w:p>
+    <w:p>
+      <w:pPr>
+        <w:numPr>
+          <w:ilvl w:val="0"/>
+          <w:numId w:val="9"/>
+        </w:numPr>
+      </w:pPr>
+      <w:r>
+        <w:t xml:space="preserve">1's Complement (-5): 11111010 (Saari bits flip </w:t>
+      </w:r>
+      <w:proofErr w:type="spellStart"/>
+      <w:r>
+        <w:t>kar</w:t>
+      </w:r>
+      <w:proofErr w:type="spellEnd"/>
+      <w:r>
+        <w:t xml:space="preserve"> di).</w:t>
+      </w:r>
+    </w:p>
+    <w:p>
+      <w:r>
+        <w:drawing>
+          <wp:inline distT="0" distB="0" distL="0" distR="0" wp14:anchorId="0FD542E9" wp14:editId="788DD6C5">
+            <wp:extent cx="5731510" cy="2802890"/>
+            <wp:effectExtent l="0" t="0" r="2540" b="0"/>
+            <wp:docPr id="2072573742" name="Picture 1" descr="A whiteboard with writing on it&#10;&#10;AI-generated content may be incorrect."/>
+            <wp:cNvGraphicFramePr>
+              <a:graphicFrameLocks xmlns:a="http://schemas.openxmlformats.org/drawingml/2006/main" noChangeAspect="1"/>
+            </wp:cNvGraphicFramePr>
+            <a:graphic xmlns:a="http://schemas.openxmlformats.org/drawingml/2006/main">
+              <a:graphicData uri="http://schemas.openxmlformats.org/drawingml/2006/picture">
+                <pic:pic xmlns:pic="http://schemas.openxmlformats.org/drawingml/2006/picture">
+                  <pic:nvPicPr>
+                    <pic:cNvPr id="2072573742" name="Picture 1" descr="A whiteboard with writing on it&#10;&#10;AI-generated content may be incorrect."/>
+                    <pic:cNvPicPr/>
+                  </pic:nvPicPr>
+                  <pic:blipFill>
+                    <a:blip r:embed="rId11"/>
+                    <a:stretch>
+                      <a:fillRect/>
+                    </a:stretch>
+                  </pic:blipFill>
+                  <pic:spPr>
+                    <a:xfrm>
+                      <a:off x="0" y="0"/>
+                      <a:ext cx="5731510" cy="2802890"/>
+                    </a:xfrm>
+                    <a:prstGeom prst="rect">
+                      <a:avLst/>
+                    </a:prstGeom>
+                  </pic:spPr>
+                </pic:pic>
+              </a:graphicData>
+            </a:graphic>
+          </wp:inline>
+        </w:drawing>
+      </w:r>
+      <w:r>
+        <w:pict w14:anchorId="2578B22C">
+          <v:rect id="_x0000_i1129" style="width:0;height:1.5pt" o:hralign="center" o:hrstd="t" o:hr="t" fillcolor="#a0a0a0" stroked="f"/>
+        </w:pict>
+      </w:r>
+    </w:p>
+    <w:p>
+      <w:pPr>
+        <w:rPr>
+          <w:b/>
+          <w:bCs/>
+        </w:rPr>
+      </w:pPr>
+      <w:r>
+        <w:rPr>
+          <w:b/>
+          <w:bCs/>
+        </w:rPr>
+        <w:t>2. Most Significant Bit (MSB) ka Role</w:t>
+      </w:r>
+    </w:p>
+    <w:p>
+      <w:r>
+        <w:t xml:space="preserve">Sir ne </w:t>
+      </w:r>
+      <w:proofErr w:type="spellStart"/>
+      <w:r>
+        <w:t>bataya</w:t>
+      </w:r>
+      <w:proofErr w:type="spellEnd"/>
+      <w:r>
+        <w:t xml:space="preserve"> ki MSB (</w:t>
+      </w:r>
+      <w:proofErr w:type="spellStart"/>
+      <w:r>
+        <w:t>sabse</w:t>
+      </w:r>
+      <w:proofErr w:type="spellEnd"/>
+      <w:r>
+        <w:t xml:space="preserve"> </w:t>
+      </w:r>
+      <w:proofErr w:type="spellStart"/>
+      <w:r>
+        <w:t>pehli</w:t>
+      </w:r>
+      <w:proofErr w:type="spellEnd"/>
+      <w:r>
+        <w:t xml:space="preserve"> bit) sign bit </w:t>
+      </w:r>
+      <w:proofErr w:type="spellStart"/>
+      <w:r>
+        <w:t>hoti</w:t>
+      </w:r>
+      <w:proofErr w:type="spellEnd"/>
+      <w:r>
+        <w:t xml:space="preserve"> </w:t>
+      </w:r>
+      <w:proofErr w:type="spellStart"/>
+      <w:r>
+        <w:t>hai</w:t>
+      </w:r>
+      <w:proofErr w:type="spellEnd"/>
+      <w:r>
+        <w:t>:</w:t>
+      </w:r>
+    </w:p>
+    <w:p>
+      <w:pPr>
+        <w:numPr>
+          <w:ilvl w:val="0"/>
+          <w:numId w:val="10"/>
+        </w:numPr>
+      </w:pPr>
+      <w:r>
+        <w:rPr>
+          <w:b/>
+          <w:bCs/>
+        </w:rPr>
+        <w:t>MSB = 0:</w:t>
+      </w:r>
+      <w:r>
+        <w:t xml:space="preserve"> Number Positive </w:t>
+      </w:r>
+      <w:proofErr w:type="spellStart"/>
+      <w:r>
+        <w:t>hai</w:t>
+      </w:r>
+      <w:proofErr w:type="spellEnd"/>
+      <w:r>
+        <w:t>.</w:t>
+      </w:r>
+    </w:p>
+    <w:p>
+      <w:pPr>
+        <w:numPr>
+          <w:ilvl w:val="0"/>
+          <w:numId w:val="10"/>
+        </w:numPr>
+      </w:pPr>
+      <w:r>
+        <w:rPr>
+          <w:b/>
+          <w:bCs/>
+        </w:rPr>
+        <w:t>MSB = 1:</w:t>
+      </w:r>
+      <w:r>
+        <w:t xml:space="preserve"> Number Negative </w:t>
+      </w:r>
+      <w:proofErr w:type="spellStart"/>
+      <w:r>
+        <w:t>hai</w:t>
+      </w:r>
+      <w:proofErr w:type="spellEnd"/>
+      <w:r>
+        <w:t>.</w:t>
+      </w:r>
+    </w:p>
+    <w:p>
+      <w:r>
+        <w:t xml:space="preserve">Ek important point: Jab hum 8-bit se 16-bit </w:t>
+      </w:r>
+      <w:proofErr w:type="spellStart"/>
+      <w:r>
+        <w:t>mein</w:t>
+      </w:r>
+      <w:proofErr w:type="spellEnd"/>
+      <w:r>
+        <w:t xml:space="preserve"> switch </w:t>
+      </w:r>
+      <w:proofErr w:type="spellStart"/>
+      <w:r>
+        <w:t>karte</w:t>
+      </w:r>
+      <w:proofErr w:type="spellEnd"/>
+      <w:r>
+        <w:t xml:space="preserve"> hain, </w:t>
+      </w:r>
+      <w:proofErr w:type="spellStart"/>
+      <w:r>
+        <w:t>toh</w:t>
+      </w:r>
+      <w:proofErr w:type="spellEnd"/>
+      <w:r>
+        <w:t xml:space="preserve"> sign bit hi </w:t>
+      </w:r>
+      <w:proofErr w:type="spellStart"/>
+      <w:r>
+        <w:t>agli</w:t>
+      </w:r>
+      <w:proofErr w:type="spellEnd"/>
+      <w:r>
+        <w:t xml:space="preserve"> sari bits </w:t>
+      </w:r>
+      <w:proofErr w:type="spellStart"/>
+      <w:r>
+        <w:t>mein</w:t>
+      </w:r>
+      <w:proofErr w:type="spellEnd"/>
+      <w:r>
+        <w:t xml:space="preserve"> </w:t>
+      </w:r>
+      <w:r>
+        <w:rPr>
+          <w:b/>
+          <w:bCs/>
+        </w:rPr>
+        <w:t>copy</w:t>
+      </w:r>
+      <w:r>
+        <w:t xml:space="preserve"> </w:t>
+      </w:r>
+      <w:proofErr w:type="spellStart"/>
+      <w:r>
+        <w:t>ho</w:t>
+      </w:r>
+      <w:proofErr w:type="spellEnd"/>
+      <w:r>
+        <w:t xml:space="preserve"> jati </w:t>
+      </w:r>
+      <w:proofErr w:type="spellStart"/>
+      <w:r>
+        <w:t>hai</w:t>
+      </w:r>
+      <w:proofErr w:type="spellEnd"/>
+      <w:r>
+        <w:t xml:space="preserve"> (Sign Extension).</w:t>
+      </w:r>
+    </w:p>
+    <w:p>
+      <w:r>
+        <w:pict w14:anchorId="22581349">
+          <v:rect id="_x0000_i1130" style="width:0;height:1.5pt" o:hralign="center" o:hrstd="t" o:hr="t" fillcolor="#a0a0a0" stroked="f"/>
+        </w:pict>
+      </w:r>
+    </w:p>
+    <w:p>
+      <w:pPr>
+        <w:rPr>
+          <w:b/>
+          <w:bCs/>
+        </w:rPr>
+      </w:pPr>
+      <w:r>
+        <w:rPr>
+          <w:b/>
+          <w:bCs/>
+        </w:rPr>
+        <w:t>3. Range of 1's Complement</w:t>
+      </w:r>
+    </w:p>
+    <w:p>
+      <w:r>
+        <w:t xml:space="preserve">Agar </w:t>
+      </w:r>
+      <w:proofErr w:type="spellStart"/>
+      <w:r>
+        <w:t>tumhare</w:t>
+      </w:r>
+      <w:proofErr w:type="spellEnd"/>
+      <w:r>
+        <w:t xml:space="preserve"> </w:t>
+      </w:r>
+      <w:proofErr w:type="spellStart"/>
+      <w:r>
+        <w:t>paas</w:t>
+      </w:r>
+      <w:proofErr w:type="spellEnd"/>
+      <w:r>
+        <w:t xml:space="preserve"> $n$ bits hain, </w:t>
+      </w:r>
+      <w:proofErr w:type="spellStart"/>
+      <w:r>
+        <w:t>toh</w:t>
+      </w:r>
+      <w:proofErr w:type="spellEnd"/>
+      <w:r>
+        <w:t xml:space="preserve"> range </w:t>
+      </w:r>
+      <w:proofErr w:type="spellStart"/>
+      <w:r>
+        <w:t>hoti</w:t>
+      </w:r>
+      <w:proofErr w:type="spellEnd"/>
+      <w:r>
+        <w:t xml:space="preserve"> </w:t>
+      </w:r>
+      <w:proofErr w:type="spellStart"/>
+      <w:r>
+        <w:t>hai</w:t>
+      </w:r>
+      <w:proofErr w:type="spellEnd"/>
+      <w:r>
+        <w:t>:</w:t>
+      </w:r>
+    </w:p>
+    <w:p>
+      <w:r>
+        <w:t>{Range</w:t>
+      </w:r>
+      <w:proofErr w:type="gramStart"/>
+      <w:r>
+        <w:t>: }</w:t>
+      </w:r>
+      <w:proofErr w:type="gramEnd"/>
+      <w:r>
+        <w:t xml:space="preserve"> -(2^{n-1} - 1) </w:t>
+      </w:r>
+      <w:proofErr w:type="gramStart"/>
+      <w:r>
+        <w:t>{ to</w:t>
+      </w:r>
+      <w:proofErr w:type="gramEnd"/>
+      <w:r>
+        <w:t xml:space="preserve"> } +(2^{n-1} - 1)</w:t>
+      </w:r>
+    </w:p>
+    <w:p>
+      <w:r>
+        <w:rPr>
+          <w:b/>
+          <w:bCs/>
+        </w:rPr>
+        <w:t>Example (8-bit):</w:t>
+      </w:r>
+    </w:p>
+    <w:p>
+      <w:r>
+        <w:lastRenderedPageBreak/>
+        <w:t xml:space="preserve">Range </w:t>
+      </w:r>
+      <w:proofErr w:type="spellStart"/>
+      <w:r>
+        <w:t>hogi</w:t>
+      </w:r>
+      <w:proofErr w:type="spellEnd"/>
+      <w:r>
+        <w:t xml:space="preserve"> -127 se +127.</w:t>
+      </w:r>
+      <w:r>
+        <w:pict w14:anchorId="27E88E12">
+          <v:rect id="_x0000_i1131" style="width:0;height:1.5pt" o:hralign="center" o:hrstd="t" o:hr="t" fillcolor="#a0a0a0" stroked="f"/>
+        </w:pict>
+      </w:r>
+    </w:p>
+    <w:p>
+      <w:pPr>
+        <w:rPr>
+          <w:b/>
+          <w:bCs/>
+        </w:rPr>
+      </w:pPr>
+      <w:r>
+        <w:rPr>
+          <w:b/>
+          <w:bCs/>
+        </w:rPr>
+        <w:t xml:space="preserve">4. Problem: Double Zero (Sabse </w:t>
+      </w:r>
+      <w:proofErr w:type="spellStart"/>
+      <w:r>
+        <w:rPr>
+          <w:b/>
+          <w:bCs/>
+        </w:rPr>
+        <w:t>bada</w:t>
+      </w:r>
+      <w:proofErr w:type="spellEnd"/>
+      <w:r>
+        <w:rPr>
+          <w:b/>
+          <w:bCs/>
+        </w:rPr>
+        <w:t xml:space="preserve"> </w:t>
+      </w:r>
+      <w:proofErr w:type="spellStart"/>
+      <w:r>
+        <w:rPr>
+          <w:b/>
+          <w:bCs/>
+        </w:rPr>
+        <w:t>nuksaan</w:t>
+      </w:r>
+      <w:proofErr w:type="spellEnd"/>
+      <w:r>
+        <w:rPr>
+          <w:b/>
+          <w:bCs/>
+        </w:rPr>
+        <w:t>)</w:t>
+      </w:r>
+    </w:p>
+    <w:p>
+      <w:r>
+        <w:t xml:space="preserve">1's complement </w:t>
+      </w:r>
+      <w:proofErr w:type="spellStart"/>
+      <w:r>
+        <w:t>mein</w:t>
+      </w:r>
+      <w:proofErr w:type="spellEnd"/>
+      <w:r>
+        <w:t xml:space="preserve"> ek </w:t>
+      </w:r>
+      <w:proofErr w:type="spellStart"/>
+      <w:r>
+        <w:t>bohot</w:t>
+      </w:r>
+      <w:proofErr w:type="spellEnd"/>
+      <w:r>
+        <w:t xml:space="preserve"> </w:t>
+      </w:r>
+      <w:proofErr w:type="spellStart"/>
+      <w:r>
+        <w:t>badi</w:t>
+      </w:r>
+      <w:proofErr w:type="spellEnd"/>
+      <w:r>
+        <w:t xml:space="preserve"> </w:t>
+      </w:r>
+      <w:proofErr w:type="spellStart"/>
+      <w:r>
+        <w:t>dikkat</w:t>
+      </w:r>
+      <w:proofErr w:type="spellEnd"/>
+      <w:r>
+        <w:t xml:space="preserve"> </w:t>
+      </w:r>
+      <w:proofErr w:type="spellStart"/>
+      <w:r>
+        <w:t>hai</w:t>
+      </w:r>
+      <w:proofErr w:type="spellEnd"/>
+      <w:r>
+        <w:t xml:space="preserve"> jo sir ne highlight kari: </w:t>
+      </w:r>
+      <w:r>
+        <w:rPr>
+          <w:b/>
+          <w:bCs/>
+        </w:rPr>
+        <w:t xml:space="preserve">Do </w:t>
+      </w:r>
+      <w:proofErr w:type="spellStart"/>
+      <w:r>
+        <w:rPr>
+          <w:b/>
+          <w:bCs/>
+        </w:rPr>
+        <w:t>tarah</w:t>
+      </w:r>
+      <w:proofErr w:type="spellEnd"/>
+      <w:r>
+        <w:rPr>
+          <w:b/>
+          <w:bCs/>
+        </w:rPr>
+        <w:t xml:space="preserve"> </w:t>
+      </w:r>
+      <w:proofErr w:type="spellStart"/>
+      <w:r>
+        <w:rPr>
+          <w:b/>
+          <w:bCs/>
+        </w:rPr>
+        <w:t>ke</w:t>
+      </w:r>
+      <w:proofErr w:type="spellEnd"/>
+      <w:r>
+        <w:rPr>
+          <w:b/>
+          <w:bCs/>
+        </w:rPr>
+        <w:t xml:space="preserve"> Zero.</w:t>
+      </w:r>
+    </w:p>
+    <w:p>
+      <w:pPr>
+        <w:numPr>
+          <w:ilvl w:val="0"/>
+          <w:numId w:val="11"/>
+        </w:numPr>
+      </w:pPr>
+      <w:r>
+        <w:t xml:space="preserve">00000000 represent </w:t>
+      </w:r>
+      <w:proofErr w:type="spellStart"/>
+      <w:r>
+        <w:t>karta</w:t>
+      </w:r>
+      <w:proofErr w:type="spellEnd"/>
+      <w:r>
+        <w:t xml:space="preserve"> </w:t>
+      </w:r>
+      <w:proofErr w:type="spellStart"/>
+      <w:r>
+        <w:t>hai</w:t>
+      </w:r>
+      <w:proofErr w:type="spellEnd"/>
+      <w:r>
+        <w:t xml:space="preserve"> </w:t>
+      </w:r>
+      <w:r>
+        <w:rPr>
+          <w:b/>
+          <w:bCs/>
+        </w:rPr>
+        <w:t>+0</w:t>
+      </w:r>
+      <w:r>
+        <w:t>.</w:t>
+      </w:r>
+    </w:p>
+    <w:p>
+      <w:pPr>
+        <w:numPr>
+          <w:ilvl w:val="0"/>
+          <w:numId w:val="11"/>
+        </w:numPr>
+      </w:pPr>
+      <w:r>
+        <w:t xml:space="preserve">11111111 represent </w:t>
+      </w:r>
+      <w:proofErr w:type="spellStart"/>
+      <w:r>
+        <w:t>karta</w:t>
+      </w:r>
+      <w:proofErr w:type="spellEnd"/>
+      <w:r>
+        <w:t xml:space="preserve"> </w:t>
+      </w:r>
+      <w:proofErr w:type="spellStart"/>
+      <w:r>
+        <w:t>hai</w:t>
+      </w:r>
+      <w:proofErr w:type="spellEnd"/>
+      <w:r>
+        <w:t xml:space="preserve"> </w:t>
+      </w:r>
+      <w:r>
+        <w:rPr>
+          <w:b/>
+          <w:bCs/>
+        </w:rPr>
+        <w:t>-0</w:t>
+      </w:r>
+      <w:r>
+        <w:t>.</w:t>
+      </w:r>
+    </w:p>
+    <w:p>
+      <w:r>
+        <w:t xml:space="preserve">Maths </w:t>
+      </w:r>
+      <w:proofErr w:type="spellStart"/>
+      <w:r>
+        <w:t>mein</w:t>
+      </w:r>
+      <w:proofErr w:type="spellEnd"/>
+      <w:r>
+        <w:t xml:space="preserve"> +0 aur -0 ek hi </w:t>
+      </w:r>
+      <w:proofErr w:type="spellStart"/>
+      <w:r>
+        <w:t>cheez</w:t>
+      </w:r>
+      <w:proofErr w:type="spellEnd"/>
+      <w:r>
+        <w:t xml:space="preserve"> </w:t>
+      </w:r>
+      <w:proofErr w:type="spellStart"/>
+      <w:r>
+        <w:t>hoti</w:t>
+      </w:r>
+      <w:proofErr w:type="spellEnd"/>
+      <w:r>
+        <w:t xml:space="preserve"> </w:t>
+      </w:r>
+      <w:proofErr w:type="spellStart"/>
+      <w:r>
+        <w:t>hai</w:t>
+      </w:r>
+      <w:proofErr w:type="spellEnd"/>
+      <w:r>
+        <w:t xml:space="preserve">, par computer memory </w:t>
+      </w:r>
+      <w:proofErr w:type="spellStart"/>
+      <w:r>
+        <w:t>mein</w:t>
+      </w:r>
+      <w:proofErr w:type="spellEnd"/>
+      <w:r>
+        <w:t xml:space="preserve"> ye do </w:t>
+      </w:r>
+      <w:proofErr w:type="spellStart"/>
+      <w:r>
+        <w:t>alag</w:t>
+      </w:r>
+      <w:proofErr w:type="spellEnd"/>
+      <w:r>
+        <w:t xml:space="preserve"> </w:t>
+      </w:r>
+      <w:proofErr w:type="spellStart"/>
+      <w:r>
+        <w:t>jagah</w:t>
+      </w:r>
+      <w:proofErr w:type="spellEnd"/>
+      <w:r>
+        <w:t xml:space="preserve"> </w:t>
+      </w:r>
+      <w:proofErr w:type="spellStart"/>
+      <w:r>
+        <w:t>gherte</w:t>
+      </w:r>
+      <w:proofErr w:type="spellEnd"/>
+      <w:r>
+        <w:t xml:space="preserve"> hain, jo ki inefficiency </w:t>
+      </w:r>
+      <w:proofErr w:type="spellStart"/>
+      <w:r>
+        <w:t>hai</w:t>
+      </w:r>
+      <w:proofErr w:type="spellEnd"/>
+      <w:r>
+        <w:t xml:space="preserve">. Yahi </w:t>
+      </w:r>
+      <w:proofErr w:type="spellStart"/>
+      <w:r>
+        <w:t>wajah</w:t>
+      </w:r>
+      <w:proofErr w:type="spellEnd"/>
+      <w:r>
+        <w:t xml:space="preserve"> </w:t>
+      </w:r>
+      <w:proofErr w:type="spellStart"/>
+      <w:r>
+        <w:t>hai</w:t>
+      </w:r>
+      <w:proofErr w:type="spellEnd"/>
+      <w:r>
+        <w:t xml:space="preserve"> ki modern computers 1's complement ki </w:t>
+      </w:r>
+      <w:proofErr w:type="spellStart"/>
+      <w:r>
+        <w:t>jagah</w:t>
+      </w:r>
+      <w:proofErr w:type="spellEnd"/>
+      <w:r>
+        <w:t xml:space="preserve"> </w:t>
+      </w:r>
+      <w:r>
+        <w:rPr>
+          <w:b/>
+          <w:bCs/>
+        </w:rPr>
+        <w:t>2's Complement</w:t>
+      </w:r>
+      <w:r>
+        <w:t xml:space="preserve"> use </w:t>
+      </w:r>
+      <w:proofErr w:type="spellStart"/>
+      <w:r>
+        <w:t>karte</w:t>
+      </w:r>
+      <w:proofErr w:type="spellEnd"/>
+      <w:r>
+        <w:t xml:space="preserve"> hain.</w:t>
+      </w:r>
+      <w:r>
+        <w:t xml:space="preserve"> </w:t>
+      </w:r>
+      <w:r>
+        <w:pict w14:anchorId="1F9F0502">
+          <v:rect id="_x0000_i1132" style="width:0;height:1.5pt" o:hralign="center" o:hrstd="t" o:hr="t" fillcolor="#a0a0a0" stroked="f"/>
+        </w:pict>
+      </w:r>
+    </w:p>
+    <w:p>
+      <w:pPr>
+        <w:rPr>
+          <w:b/>
+          <w:bCs/>
+        </w:rPr>
+      </w:pPr>
+      <w:r>
+        <w:rPr>
+          <w:b/>
+          <w:bCs/>
+        </w:rPr>
+        <w:t>5. Reverse Engineering (Finding Decimal from 1's Comp)</w:t>
+      </w:r>
+    </w:p>
+    <w:p>
+      <w:r>
+        <w:t xml:space="preserve">Agar </w:t>
+      </w:r>
+      <w:proofErr w:type="spellStart"/>
+      <w:r>
+        <w:t>tumhe</w:t>
+      </w:r>
+      <w:proofErr w:type="spellEnd"/>
+      <w:r>
+        <w:t xml:space="preserve"> koi binary number diya </w:t>
+      </w:r>
+      <w:proofErr w:type="spellStart"/>
+      <w:r>
+        <w:t>hai</w:t>
+      </w:r>
+      <w:proofErr w:type="spellEnd"/>
+      <w:r>
+        <w:t xml:space="preserve"> (MSB = 1) aur </w:t>
+      </w:r>
+      <w:proofErr w:type="spellStart"/>
+      <w:r>
+        <w:t>pucha</w:t>
+      </w:r>
+      <w:proofErr w:type="spellEnd"/>
+      <w:r>
+        <w:t xml:space="preserve"> </w:t>
+      </w:r>
+      <w:proofErr w:type="spellStart"/>
+      <w:r>
+        <w:t>jaye</w:t>
+      </w:r>
+      <w:proofErr w:type="spellEnd"/>
+      <w:r>
+        <w:t xml:space="preserve"> ye </w:t>
+      </w:r>
+      <w:proofErr w:type="spellStart"/>
+      <w:r>
+        <w:t>kaunsa</w:t>
+      </w:r>
+      <w:proofErr w:type="spellEnd"/>
+      <w:r>
+        <w:t xml:space="preserve"> decimal </w:t>
+      </w:r>
+      <w:proofErr w:type="spellStart"/>
+      <w:r>
+        <w:t>hai</w:t>
+      </w:r>
+      <w:proofErr w:type="spellEnd"/>
+      <w:r>
+        <w:t>:</w:t>
+      </w:r>
+    </w:p>
+    <w:p>
+      <w:pPr>
+        <w:numPr>
+          <w:ilvl w:val="0"/>
+          <w:numId w:val="12"/>
+        </w:numPr>
+      </w:pPr>
+      <w:r>
+        <w:t xml:space="preserve">Pehle us binary ka fir se 1's complement </w:t>
+      </w:r>
+      <w:proofErr w:type="spellStart"/>
+      <w:r>
+        <w:t>nikalo</w:t>
+      </w:r>
+      <w:proofErr w:type="spellEnd"/>
+      <w:r>
+        <w:t xml:space="preserve"> (bits flip karo).</w:t>
+      </w:r>
+    </w:p>
+    <w:p>
+      <w:pPr>
+        <w:numPr>
+          <w:ilvl w:val="0"/>
+          <w:numId w:val="12"/>
+        </w:numPr>
+      </w:pPr>
+      <w:r>
+        <w:t xml:space="preserve">Jo result </w:t>
+      </w:r>
+      <w:proofErr w:type="spellStart"/>
+      <w:r>
+        <w:t>aaye</w:t>
+      </w:r>
+      <w:proofErr w:type="spellEnd"/>
+      <w:r>
+        <w:t xml:space="preserve"> </w:t>
+      </w:r>
+      <w:proofErr w:type="spellStart"/>
+      <w:r>
+        <w:t>uska</w:t>
+      </w:r>
+      <w:proofErr w:type="spellEnd"/>
+      <w:r>
+        <w:t xml:space="preserve"> decimal </w:t>
+      </w:r>
+      <w:proofErr w:type="spellStart"/>
+      <w:r>
+        <w:t>nikal</w:t>
+      </w:r>
+      <w:proofErr w:type="spellEnd"/>
+      <w:r>
+        <w:t xml:space="preserve"> lo.</w:t>
+      </w:r>
+    </w:p>
+    <w:p>
+      <w:pPr>
+        <w:numPr>
+          <w:ilvl w:val="0"/>
+          <w:numId w:val="12"/>
+        </w:numPr>
+      </w:pPr>
+      <w:r>
+        <w:t xml:space="preserve">Agey minus (-) sign </w:t>
+      </w:r>
+      <w:proofErr w:type="spellStart"/>
+      <w:r>
+        <w:t>laga</w:t>
+      </w:r>
+      <w:proofErr w:type="spellEnd"/>
+      <w:r>
+        <w:t xml:space="preserve"> do.</w:t>
+      </w:r>
+    </w:p>
+    <w:p>
+      <w:r>
+        <w:pict w14:anchorId="328FE79B">
+          <v:rect id="_x0000_i1133" style="width:0;height:1.5pt" o:hralign="center" o:hrstd="t" o:hr="t" fillcolor="#a0a0a0" stroked="f"/>
+        </w:pict>
+      </w:r>
+    </w:p>
+    <w:p>
+      <w:pPr>
+        <w:rPr>
+          <w:b/>
+          <w:bCs/>
+        </w:rPr>
+      </w:pPr>
+      <w:r>
+        <w:rPr>
+          <w:b/>
+          <w:bCs/>
+        </w:rPr>
+        <w:t>6. Summary Table for your Notes</w:t>
+      </w:r>
+    </w:p>
+    <w:tbl>
+      <w:tblPr>
+        <w:tblW w:w="0" w:type="auto"/>
+        <w:tblCellSpacing w:w="15" w:type="dxa"/>
+        <w:tblCellMar>
+          <w:top w:w="15" w:type="dxa"/>
+          <w:left w:w="15" w:type="dxa"/>
+          <w:bottom w:w="15" w:type="dxa"/>
+          <w:right w:w="15" w:type="dxa"/>
+        </w:tblCellMar>
+        <w:tblLook w:val="04A0" w:firstRow="1" w:lastRow="0" w:firstColumn="1" w:lastColumn="0" w:noHBand="0" w:noVBand="1"/>
+      </w:tblPr>
+      <w:tblGrid>
+        <w:gridCol w:w="1412"/>
+        <w:gridCol w:w="1383"/>
+      </w:tblGrid>
+      <w:tr>
+        <w:trPr>
+          <w:tblHeader/>
+          <w:tblCellSpacing w:w="15" w:type="dxa"/>
+        </w:trPr>
+        <w:tc>
+          <w:tcPr>
+            <w:tcW w:w="0" w:type="auto"/>
+            <w:tcBorders>
+              <w:top w:val="single" w:sz="6" w:space="0" w:color="auto"/>
+              <w:left w:val="single" w:sz="6" w:space="0" w:color="auto"/>
+              <w:bottom w:val="single" w:sz="6" w:space="0" w:color="auto"/>
+              <w:right w:val="single" w:sz="6" w:space="0" w:color="auto"/>
+            </w:tcBorders>
+            <w:vAlign w:val="center"/>
+            <w:hideMark/>
+          </w:tcPr>
+          <w:p>
+            <w:r>
+              <w:rPr>
+                <w:b/>
+                <w:bCs/>
+              </w:rPr>
+              <w:t>Action</w:t>
+            </w:r>
+          </w:p>
+        </w:tc>
+        <w:tc>
+          <w:tcPr>
+            <w:tcW w:w="0" w:type="auto"/>
+            <w:tcBorders>
+              <w:top w:val="single" w:sz="6" w:space="0" w:color="auto"/>
+              <w:left w:val="single" w:sz="6" w:space="0" w:color="auto"/>
+              <w:bottom w:val="single" w:sz="6" w:space="0" w:color="auto"/>
+              <w:right w:val="single" w:sz="6" w:space="0" w:color="auto"/>
+            </w:tcBorders>
+            <w:vAlign w:val="center"/>
+            <w:hideMark/>
+          </w:tcPr>
+          <w:p>
+            <w:r>
+              <w:rPr>
+                <w:b/>
+                <w:bCs/>
+              </w:rPr>
+              <w:t>Result/Value</w:t>
+            </w:r>
+          </w:p>
+        </w:tc>
+      </w:tr>
+      <w:tr>
+        <w:trPr>
+          <w:tblCellSpacing w:w="15" w:type="dxa"/>
+        </w:trPr>
+        <w:tc>
+          <w:tcPr>
+            <w:tcW w:w="0" w:type="auto"/>
+            <w:tcBorders>
+              <w:top w:val="single" w:sz="6" w:space="0" w:color="auto"/>
+              <w:left w:val="single" w:sz="6" w:space="0" w:color="auto"/>
+              <w:bottom w:val="single" w:sz="6" w:space="0" w:color="auto"/>
+              <w:right w:val="single" w:sz="6" w:space="0" w:color="auto"/>
+            </w:tcBorders>
+            <w:vAlign w:val="center"/>
+            <w:hideMark/>
+          </w:tcPr>
+          <w:p>
+            <w:r>
+              <w:rPr>
+                <w:b/>
+                <w:bCs/>
+              </w:rPr>
+              <w:t>+5 (8-bit)</w:t>
+            </w:r>
+          </w:p>
+        </w:tc>
+        <w:tc>
+          <w:tcPr>
+            <w:tcW w:w="0" w:type="auto"/>
+            <w:tcBorders>
+              <w:top w:val="single" w:sz="6" w:space="0" w:color="auto"/>
+              <w:left w:val="single" w:sz="6" w:space="0" w:color="auto"/>
+              <w:bottom w:val="single" w:sz="6" w:space="0" w:color="auto"/>
+              <w:right w:val="single" w:sz="6" w:space="0" w:color="auto"/>
+            </w:tcBorders>
+            <w:vAlign w:val="center"/>
+            <w:hideMark/>
+          </w:tcPr>
+          <w:p>
+            <w:r>
+              <w:t>00000101</w:t>
+            </w:r>
+          </w:p>
+        </w:tc>
+      </w:tr>
+      <w:tr>
+        <w:trPr>
+          <w:tblCellSpacing w:w="15" w:type="dxa"/>
+        </w:trPr>
+        <w:tc>
+          <w:tcPr>
+            <w:tcW w:w="0" w:type="auto"/>
+            <w:tcBorders>
+              <w:top w:val="single" w:sz="6" w:space="0" w:color="auto"/>
+              <w:left w:val="single" w:sz="6" w:space="0" w:color="auto"/>
+              <w:bottom w:val="single" w:sz="6" w:space="0" w:color="auto"/>
+              <w:right w:val="single" w:sz="6" w:space="0" w:color="auto"/>
+            </w:tcBorders>
+            <w:vAlign w:val="center"/>
+            <w:hideMark/>
+          </w:tcPr>
+          <w:p>
+            <w:r>
+              <w:rPr>
+                <w:b/>
+                <w:bCs/>
+              </w:rPr>
+              <w:t>-5 (1's Comp)</w:t>
+            </w:r>
+          </w:p>
+        </w:tc>
+        <w:tc>
+          <w:tcPr>
+            <w:tcW w:w="0" w:type="auto"/>
+            <w:tcBorders>
+              <w:top w:val="single" w:sz="6" w:space="0" w:color="auto"/>
+              <w:left w:val="single" w:sz="6" w:space="0" w:color="auto"/>
+              <w:bottom w:val="single" w:sz="6" w:space="0" w:color="auto"/>
+              <w:right w:val="single" w:sz="6" w:space="0" w:color="auto"/>
+            </w:tcBorders>
+            <w:vAlign w:val="center"/>
+            <w:hideMark/>
+          </w:tcPr>
+          <w:p>
+            <w:r>
+              <w:t>11111010</w:t>
+            </w:r>
+          </w:p>
+        </w:tc>
+      </w:tr>
+      <w:tr>
+        <w:trPr>
+          <w:tblCellSpacing w:w="15" w:type="dxa"/>
+        </w:trPr>
+        <w:tc>
+          <w:tcPr>
+            <w:tcW w:w="0" w:type="auto"/>
+            <w:tcBorders>
+              <w:top w:val="single" w:sz="6" w:space="0" w:color="auto"/>
+              <w:left w:val="single" w:sz="6" w:space="0" w:color="auto"/>
+              <w:bottom w:val="single" w:sz="6" w:space="0" w:color="auto"/>
+              <w:right w:val="single" w:sz="6" w:space="0" w:color="auto"/>
+            </w:tcBorders>
+            <w:vAlign w:val="center"/>
+            <w:hideMark/>
+          </w:tcPr>
+          <w:p>
+            <w:r>
+              <w:rPr>
+                <w:b/>
+                <w:bCs/>
+              </w:rPr>
+              <w:t>Zero (+0)</w:t>
+            </w:r>
+          </w:p>
+        </w:tc>
+        <w:tc>
+          <w:tcPr>
+            <w:tcW w:w="0" w:type="auto"/>
+            <w:tcBorders>
+              <w:top w:val="single" w:sz="6" w:space="0" w:color="auto"/>
+              <w:left w:val="single" w:sz="6" w:space="0" w:color="auto"/>
+              <w:bottom w:val="single" w:sz="6" w:space="0" w:color="auto"/>
+              <w:right w:val="single" w:sz="6" w:space="0" w:color="auto"/>
+            </w:tcBorders>
+            <w:vAlign w:val="center"/>
+            <w:hideMark/>
+          </w:tcPr>
+          <w:p>
+            <w:r>
+              <w:t>00000000</w:t>
+            </w:r>
+          </w:p>
+        </w:tc>
+      </w:tr>
+      <w:tr>
+        <w:trPr>
+          <w:tblCellSpacing w:w="15" w:type="dxa"/>
+        </w:trPr>
+        <w:tc>
+          <w:tcPr>
+            <w:tcW w:w="0" w:type="auto"/>
+            <w:tcBorders>
+              <w:top w:val="single" w:sz="6" w:space="0" w:color="auto"/>
+              <w:left w:val="single" w:sz="6" w:space="0" w:color="auto"/>
+              <w:bottom w:val="single" w:sz="6" w:space="0" w:color="auto"/>
+              <w:right w:val="single" w:sz="6" w:space="0" w:color="auto"/>
+            </w:tcBorders>
+            <w:vAlign w:val="center"/>
+            <w:hideMark/>
+          </w:tcPr>
+          <w:p>
+            <w:r>
+              <w:rPr>
+                <w:b/>
+                <w:bCs/>
+              </w:rPr>
+              <w:t>Zero (-0)</w:t>
+            </w:r>
+          </w:p>
+        </w:tc>
+        <w:tc>
+          <w:tcPr>
+            <w:tcW w:w="0" w:type="auto"/>
+            <w:tcBorders>
+              <w:top w:val="single" w:sz="6" w:space="0" w:color="auto"/>
+              <w:left w:val="single" w:sz="6" w:space="0" w:color="auto"/>
+              <w:bottom w:val="single" w:sz="6" w:space="0" w:color="auto"/>
+              <w:right w:val="single" w:sz="6" w:space="0" w:color="auto"/>
+            </w:tcBorders>
+            <w:vAlign w:val="center"/>
+            <w:hideMark/>
+          </w:tcPr>
+          <w:p>
+            <w:r>
+              <w:t>11111111</w:t>
+            </w:r>
+          </w:p>
+        </w:tc>
+      </w:tr>
+    </w:tbl>
+    <w:p>
+      <w:r>
+        <w:lastRenderedPageBreak/>
+        <w:drawing>
+          <wp:inline distT="0" distB="0" distL="0" distR="0" wp14:anchorId="48A3CD21" wp14:editId="7C6185B7">
+            <wp:extent cx="5658640" cy="4582164"/>
+            <wp:effectExtent l="0" t="0" r="0" b="8890"/>
+            <wp:docPr id="1549245885" name="Picture 1" descr="A screenshot of a whiteboard&#10;&#10;AI-generated content may be incorrect."/>
+            <wp:cNvGraphicFramePr>
+              <a:graphicFrameLocks xmlns:a="http://schemas.openxmlformats.org/drawingml/2006/main" noChangeAspect="1"/>
+            </wp:cNvGraphicFramePr>
+            <a:graphic xmlns:a="http://schemas.openxmlformats.org/drawingml/2006/main">
+              <a:graphicData uri="http://schemas.openxmlformats.org/drawingml/2006/picture">
+                <pic:pic xmlns:pic="http://schemas.openxmlformats.org/drawingml/2006/picture">
+                  <pic:nvPicPr>
+                    <pic:cNvPr id="1549245885" name="Picture 1" descr="A screenshot of a whiteboard&#10;&#10;AI-generated content may be incorrect."/>
+                    <pic:cNvPicPr/>
+                  </pic:nvPicPr>
+                  <pic:blipFill>
+                    <a:blip r:embed="rId12"/>
+                    <a:stretch>
+                      <a:fillRect/>
+                    </a:stretch>
+                  </pic:blipFill>
+                  <pic:spPr>
+                    <a:xfrm>
+                      <a:off x="0" y="0"/>
+                      <a:ext cx="5658640" cy="4582164"/>
+                    </a:xfrm>
+                    <a:prstGeom prst="rect">
+                      <a:avLst/>
+                    </a:prstGeom>
+                  </pic:spPr>
+                </pic:pic>
+              </a:graphicData>
+            </a:graphic>
+          </wp:inline>
+        </w:drawing>
+      </w:r>
+      <w:r>
+        <w:pict w14:anchorId="532CA7AA">
+          <v:rect id="_x0000_i1139" style="width:0;height:1.5pt" o:hralign="center" o:hrstd="t" o:hr="t" fillcolor="#a0a0a0" stroked="f"/>
+        </w:pict>
+      </w:r>
+    </w:p>
     <w:p/>
     <w:sectPr>
       <w:pgSz w:w="11906" w:h="16838"/>
@@ -1964,6 +5415,268 @@
     </w:lvl>
   </w:abstractNum>
   <w:abstractNum w:abstractNumId="1" w15:restartNumberingAfterBreak="0">
+    <w:nsid w:val="2625163F"/>
+    <w:multiLevelType w:val="multilevel"/>
+    <w:tmpl w:val="2F68F55A"/>
+    <w:lvl w:ilvl="0">
+      <w:start w:val="1"/>
+      <w:numFmt w:val="decimal"/>
+      <w:lvlText w:val="%1."/>
+      <w:lvlJc w:val="left"/>
+      <w:pPr>
+        <w:tabs>
+          <w:tab w:val="num" w:pos="720"/>
+        </w:tabs>
+        <w:ind w:left="720" w:hanging="360"/>
+      </w:pPr>
+    </w:lvl>
+    <w:lvl w:ilvl="1" w:tentative="1">
+      <w:start w:val="1"/>
+      <w:numFmt w:val="decimal"/>
+      <w:lvlText w:val="%2."/>
+      <w:lvlJc w:val="left"/>
+      <w:pPr>
+        <w:tabs>
+          <w:tab w:val="num" w:pos="1440"/>
+        </w:tabs>
+        <w:ind w:left="1440" w:hanging="360"/>
+      </w:pPr>
+    </w:lvl>
+    <w:lvl w:ilvl="2" w:tentative="1">
+      <w:start w:val="1"/>
+      <w:numFmt w:val="decimal"/>
+      <w:lvlText w:val="%3."/>
+      <w:lvlJc w:val="left"/>
+      <w:pPr>
+        <w:tabs>
+          <w:tab w:val="num" w:pos="2160"/>
+        </w:tabs>
+        <w:ind w:left="2160" w:hanging="360"/>
+      </w:pPr>
+    </w:lvl>
+    <w:lvl w:ilvl="3" w:tentative="1">
+      <w:start w:val="1"/>
+      <w:numFmt w:val="decimal"/>
+      <w:lvlText w:val="%4."/>
+      <w:lvlJc w:val="left"/>
+      <w:pPr>
+        <w:tabs>
+          <w:tab w:val="num" w:pos="2880"/>
+        </w:tabs>
+        <w:ind w:left="2880" w:hanging="360"/>
+      </w:pPr>
+    </w:lvl>
+    <w:lvl w:ilvl="4" w:tentative="1">
+      <w:start w:val="1"/>
+      <w:numFmt w:val="decimal"/>
+      <w:lvlText w:val="%5."/>
+      <w:lvlJc w:val="left"/>
+      <w:pPr>
+        <w:tabs>
+          <w:tab w:val="num" w:pos="3600"/>
+        </w:tabs>
+        <w:ind w:left="3600" w:hanging="360"/>
+      </w:pPr>
+    </w:lvl>
+    <w:lvl w:ilvl="5" w:tentative="1">
+      <w:start w:val="1"/>
+      <w:numFmt w:val="decimal"/>
+      <w:lvlText w:val="%6."/>
+      <w:lvlJc w:val="left"/>
+      <w:pPr>
+        <w:tabs>
+          <w:tab w:val="num" w:pos="4320"/>
+        </w:tabs>
+        <w:ind w:left="4320" w:hanging="360"/>
+      </w:pPr>
+    </w:lvl>
+    <w:lvl w:ilvl="6" w:tentative="1">
+      <w:start w:val="1"/>
+      <w:numFmt w:val="decimal"/>
+      <w:lvlText w:val="%7."/>
+      <w:lvlJc w:val="left"/>
+      <w:pPr>
+        <w:tabs>
+          <w:tab w:val="num" w:pos="5040"/>
+        </w:tabs>
+        <w:ind w:left="5040" w:hanging="360"/>
+      </w:pPr>
+    </w:lvl>
+    <w:lvl w:ilvl="7" w:tentative="1">
+      <w:start w:val="1"/>
+      <w:numFmt w:val="decimal"/>
+      <w:lvlText w:val="%8."/>
+      <w:lvlJc w:val="left"/>
+      <w:pPr>
+        <w:tabs>
+          <w:tab w:val="num" w:pos="5760"/>
+        </w:tabs>
+        <w:ind w:left="5760" w:hanging="360"/>
+      </w:pPr>
+    </w:lvl>
+    <w:lvl w:ilvl="8" w:tentative="1">
+      <w:start w:val="1"/>
+      <w:numFmt w:val="decimal"/>
+      <w:lvlText w:val="%9."/>
+      <w:lvlJc w:val="left"/>
+      <w:pPr>
+        <w:tabs>
+          <w:tab w:val="num" w:pos="6480"/>
+        </w:tabs>
+        <w:ind w:left="6480" w:hanging="360"/>
+      </w:pPr>
+    </w:lvl>
+  </w:abstractNum>
+  <w:abstractNum w:abstractNumId="2" w15:restartNumberingAfterBreak="0">
+    <w:nsid w:val="2AD2737F"/>
+    <w:multiLevelType w:val="multilevel"/>
+    <w:tmpl w:val="1AA8295C"/>
+    <w:lvl w:ilvl="0">
+      <w:start w:val="1"/>
+      <w:numFmt w:val="bullet"/>
+      <w:lvlText w:val=""/>
+      <w:lvlJc w:val="left"/>
+      <w:pPr>
+        <w:tabs>
+          <w:tab w:val="num" w:pos="720"/>
+        </w:tabs>
+        <w:ind w:left="720" w:hanging="360"/>
+      </w:pPr>
+      <w:rPr>
+        <w:rFonts w:ascii="Symbol" w:hAnsi="Symbol" w:hint="default"/>
+        <w:sz w:val="20"/>
+      </w:rPr>
+    </w:lvl>
+    <w:lvl w:ilvl="1" w:tentative="1">
+      <w:start w:val="1"/>
+      <w:numFmt w:val="bullet"/>
+      <w:lvlText w:val="o"/>
+      <w:lvlJc w:val="left"/>
+      <w:pPr>
+        <w:tabs>
+          <w:tab w:val="num" w:pos="1440"/>
+        </w:tabs>
+        <w:ind w:left="1440" w:hanging="360"/>
+      </w:pPr>
+      <w:rPr>
+        <w:rFonts w:ascii="Courier New" w:hAnsi="Courier New" w:hint="default"/>
+        <w:sz w:val="20"/>
+      </w:rPr>
+    </w:lvl>
+    <w:lvl w:ilvl="2" w:tentative="1">
+      <w:start w:val="1"/>
+      <w:numFmt w:val="bullet"/>
+      <w:lvlText w:val=""/>
+      <w:lvlJc w:val="left"/>
+      <w:pPr>
+        <w:tabs>
+          <w:tab w:val="num" w:pos="2160"/>
+        </w:tabs>
+        <w:ind w:left="2160" w:hanging="360"/>
+      </w:pPr>
+      <w:rPr>
+        <w:rFonts w:ascii="Wingdings" w:hAnsi="Wingdings" w:hint="default"/>
+        <w:sz w:val="20"/>
+      </w:rPr>
+    </w:lvl>
+    <w:lvl w:ilvl="3" w:tentative="1">
+      <w:start w:val="1"/>
+      <w:numFmt w:val="bullet"/>
+      <w:lvlText w:val=""/>
+      <w:lvlJc w:val="left"/>
+      <w:pPr>
+        <w:tabs>
+          <w:tab w:val="num" w:pos="2880"/>
+        </w:tabs>
+        <w:ind w:left="2880" w:hanging="360"/>
+      </w:pPr>
+      <w:rPr>
+        <w:rFonts w:ascii="Wingdings" w:hAnsi="Wingdings" w:hint="default"/>
+        <w:sz w:val="20"/>
+      </w:rPr>
+    </w:lvl>
+    <w:lvl w:ilvl="4" w:tentative="1">
+      <w:start w:val="1"/>
+      <w:numFmt w:val="bullet"/>
+      <w:lvlText w:val=""/>
+      <w:lvlJc w:val="left"/>
+      <w:pPr>
+        <w:tabs>
+          <w:tab w:val="num" w:pos="3600"/>
+        </w:tabs>
+        <w:ind w:left="3600" w:hanging="360"/>
+      </w:pPr>
+      <w:rPr>
+        <w:rFonts w:ascii="Wingdings" w:hAnsi="Wingdings" w:hint="default"/>
+        <w:sz w:val="20"/>
+      </w:rPr>
+    </w:lvl>
+    <w:lvl w:ilvl="5" w:tentative="1">
+      <w:start w:val="1"/>
+      <w:numFmt w:val="bullet"/>
+      <w:lvlText w:val=""/>
+      <w:lvlJc w:val="left"/>
+      <w:pPr>
+        <w:tabs>
+          <w:tab w:val="num" w:pos="4320"/>
+        </w:tabs>
+        <w:ind w:left="4320" w:hanging="360"/>
+      </w:pPr>
+      <w:rPr>
+        <w:rFonts w:ascii="Wingdings" w:hAnsi="Wingdings" w:hint="default"/>
+        <w:sz w:val="20"/>
+      </w:rPr>
+    </w:lvl>
+    <w:lvl w:ilvl="6" w:tentative="1">
+      <w:start w:val="1"/>
+      <w:numFmt w:val="bullet"/>
+      <w:lvlText w:val=""/>
+      <w:lvlJc w:val="left"/>
+      <w:pPr>
+        <w:tabs>
+          <w:tab w:val="num" w:pos="5040"/>
+        </w:tabs>
+        <w:ind w:left="5040" w:hanging="360"/>
+      </w:pPr>
+      <w:rPr>
+        <w:rFonts w:ascii="Wingdings" w:hAnsi="Wingdings" w:hint="default"/>
+        <w:sz w:val="20"/>
+      </w:rPr>
+    </w:lvl>
+    <w:lvl w:ilvl="7" w:tentative="1">
+      <w:start w:val="1"/>
+      <w:numFmt w:val="bullet"/>
+      <w:lvlText w:val=""/>
+      <w:lvlJc w:val="left"/>
+      <w:pPr>
+        <w:tabs>
+          <w:tab w:val="num" w:pos="5760"/>
+        </w:tabs>
+        <w:ind w:left="5760" w:hanging="360"/>
+      </w:pPr>
+      <w:rPr>
+        <w:rFonts w:ascii="Wingdings" w:hAnsi="Wingdings" w:hint="default"/>
+        <w:sz w:val="20"/>
+      </w:rPr>
+    </w:lvl>
+    <w:lvl w:ilvl="8" w:tentative="1">
+      <w:start w:val="1"/>
+      <w:numFmt w:val="bullet"/>
+      <w:lvlText w:val=""/>
+      <w:lvlJc w:val="left"/>
+      <w:pPr>
+        <w:tabs>
+          <w:tab w:val="num" w:pos="6480"/>
+        </w:tabs>
+        <w:ind w:left="6480" w:hanging="360"/>
+      </w:pPr>
+      <w:rPr>
+        <w:rFonts w:ascii="Wingdings" w:hAnsi="Wingdings" w:hint="default"/>
+        <w:sz w:val="20"/>
+      </w:rPr>
+    </w:lvl>
+  </w:abstractNum>
+  <w:abstractNum w:abstractNumId="3" w15:restartNumberingAfterBreak="0">
     <w:nsid w:val="30765618"/>
     <w:multiLevelType w:val="multilevel"/>
     <w:tmpl w:val="6364505E"/>
@@ -2112,7 +5825,120 @@
       </w:rPr>
     </w:lvl>
   </w:abstractNum>
-  <w:abstractNum w:abstractNumId="2" w15:restartNumberingAfterBreak="0">
+  <w:abstractNum w:abstractNumId="4" w15:restartNumberingAfterBreak="0">
+    <w:nsid w:val="34E32EAF"/>
+    <w:multiLevelType w:val="multilevel"/>
+    <w:tmpl w:val="3BF2072C"/>
+    <w:lvl w:ilvl="0">
+      <w:start w:val="1"/>
+      <w:numFmt w:val="decimal"/>
+      <w:lvlText w:val="%1."/>
+      <w:lvlJc w:val="left"/>
+      <w:pPr>
+        <w:tabs>
+          <w:tab w:val="num" w:pos="720"/>
+        </w:tabs>
+        <w:ind w:left="720" w:hanging="360"/>
+      </w:pPr>
+    </w:lvl>
+    <w:lvl w:ilvl="1" w:tentative="1">
+      <w:start w:val="1"/>
+      <w:numFmt w:val="decimal"/>
+      <w:lvlText w:val="%2."/>
+      <w:lvlJc w:val="left"/>
+      <w:pPr>
+        <w:tabs>
+          <w:tab w:val="num" w:pos="1440"/>
+        </w:tabs>
+        <w:ind w:left="1440" w:hanging="360"/>
+      </w:pPr>
+    </w:lvl>
+    <w:lvl w:ilvl="2" w:tentative="1">
+      <w:start w:val="1"/>
+      <w:numFmt w:val="decimal"/>
+      <w:lvlText w:val="%3."/>
+      <w:lvlJc w:val="left"/>
+      <w:pPr>
+        <w:tabs>
+          <w:tab w:val="num" w:pos="2160"/>
+        </w:tabs>
+        <w:ind w:left="2160" w:hanging="360"/>
+      </w:pPr>
+    </w:lvl>
+    <w:lvl w:ilvl="3" w:tentative="1">
+      <w:start w:val="1"/>
+      <w:numFmt w:val="decimal"/>
+      <w:lvlText w:val="%4."/>
+      <w:lvlJc w:val="left"/>
+      <w:pPr>
+        <w:tabs>
+          <w:tab w:val="num" w:pos="2880"/>
+        </w:tabs>
+        <w:ind w:left="2880" w:hanging="360"/>
+      </w:pPr>
+    </w:lvl>
+    <w:lvl w:ilvl="4" w:tentative="1">
+      <w:start w:val="1"/>
+      <w:numFmt w:val="decimal"/>
+      <w:lvlText w:val="%5."/>
+      <w:lvlJc w:val="left"/>
+      <w:pPr>
+        <w:tabs>
+          <w:tab w:val="num" w:pos="3600"/>
+        </w:tabs>
+        <w:ind w:left="3600" w:hanging="360"/>
+      </w:pPr>
+    </w:lvl>
+    <w:lvl w:ilvl="5" w:tentative="1">
+      <w:start w:val="1"/>
+      <w:numFmt w:val="decimal"/>
+      <w:lvlText w:val="%6."/>
+      <w:lvlJc w:val="left"/>
+      <w:pPr>
+        <w:tabs>
+          <w:tab w:val="num" w:pos="4320"/>
+        </w:tabs>
+        <w:ind w:left="4320" w:hanging="360"/>
+      </w:pPr>
+    </w:lvl>
+    <w:lvl w:ilvl="6" w:tentative="1">
+      <w:start w:val="1"/>
+      <w:numFmt w:val="decimal"/>
+      <w:lvlText w:val="%7."/>
+      <w:lvlJc w:val="left"/>
+      <w:pPr>
+        <w:tabs>
+          <w:tab w:val="num" w:pos="5040"/>
+        </w:tabs>
+        <w:ind w:left="5040" w:hanging="360"/>
+      </w:pPr>
+    </w:lvl>
+    <w:lvl w:ilvl="7" w:tentative="1">
+      <w:start w:val="1"/>
+      <w:numFmt w:val="decimal"/>
+      <w:lvlText w:val="%8."/>
+      <w:lvlJc w:val="left"/>
+      <w:pPr>
+        <w:tabs>
+          <w:tab w:val="num" w:pos="5760"/>
+        </w:tabs>
+        <w:ind w:left="5760" w:hanging="360"/>
+      </w:pPr>
+    </w:lvl>
+    <w:lvl w:ilvl="8" w:tentative="1">
+      <w:start w:val="1"/>
+      <w:numFmt w:val="decimal"/>
+      <w:lvlText w:val="%9."/>
+      <w:lvlJc w:val="left"/>
+      <w:pPr>
+        <w:tabs>
+          <w:tab w:val="num" w:pos="6480"/>
+        </w:tabs>
+        <w:ind w:left="6480" w:hanging="360"/>
+      </w:pPr>
+    </w:lvl>
+  </w:abstractNum>
+  <w:abstractNum w:abstractNumId="5" w15:restartNumberingAfterBreak="0">
     <w:nsid w:val="4E11318F"/>
     <w:multiLevelType w:val="multilevel"/>
     <w:tmpl w:val="F20C7C84"/>
@@ -2261,7 +6087,7 @@
       </w:rPr>
     </w:lvl>
   </w:abstractNum>
-  <w:abstractNum w:abstractNumId="3" w15:restartNumberingAfterBreak="0">
+  <w:abstractNum w:abstractNumId="6" w15:restartNumberingAfterBreak="0">
     <w:nsid w:val="4FC21782"/>
     <w:multiLevelType w:val="multilevel"/>
     <w:tmpl w:val="2C7A8910"/>
@@ -2410,7 +6236,156 @@
       </w:rPr>
     </w:lvl>
   </w:abstractNum>
-  <w:abstractNum w:abstractNumId="4" w15:restartNumberingAfterBreak="0">
+  <w:abstractNum w:abstractNumId="7" w15:restartNumberingAfterBreak="0">
+    <w:nsid w:val="52682430"/>
+    <w:multiLevelType w:val="multilevel"/>
+    <w:tmpl w:val="2126251E"/>
+    <w:lvl w:ilvl="0">
+      <w:start w:val="1"/>
+      <w:numFmt w:val="bullet"/>
+      <w:lvlText w:val=""/>
+      <w:lvlJc w:val="left"/>
+      <w:pPr>
+        <w:tabs>
+          <w:tab w:val="num" w:pos="720"/>
+        </w:tabs>
+        <w:ind w:left="720" w:hanging="360"/>
+      </w:pPr>
+      <w:rPr>
+        <w:rFonts w:ascii="Symbol" w:hAnsi="Symbol" w:hint="default"/>
+        <w:sz w:val="20"/>
+      </w:rPr>
+    </w:lvl>
+    <w:lvl w:ilvl="1" w:tentative="1">
+      <w:start w:val="1"/>
+      <w:numFmt w:val="bullet"/>
+      <w:lvlText w:val="o"/>
+      <w:lvlJc w:val="left"/>
+      <w:pPr>
+        <w:tabs>
+          <w:tab w:val="num" w:pos="1440"/>
+        </w:tabs>
+        <w:ind w:left="1440" w:hanging="360"/>
+      </w:pPr>
+      <w:rPr>
+        <w:rFonts w:ascii="Courier New" w:hAnsi="Courier New" w:hint="default"/>
+        <w:sz w:val="20"/>
+      </w:rPr>
+    </w:lvl>
+    <w:lvl w:ilvl="2" w:tentative="1">
+      <w:start w:val="1"/>
+      <w:numFmt w:val="bullet"/>
+      <w:lvlText w:val=""/>
+      <w:lvlJc w:val="left"/>
+      <w:pPr>
+        <w:tabs>
+          <w:tab w:val="num" w:pos="2160"/>
+        </w:tabs>
+        <w:ind w:left="2160" w:hanging="360"/>
+      </w:pPr>
+      <w:rPr>
+        <w:rFonts w:ascii="Wingdings" w:hAnsi="Wingdings" w:hint="default"/>
+        <w:sz w:val="20"/>
+      </w:rPr>
+    </w:lvl>
+    <w:lvl w:ilvl="3" w:tentative="1">
+      <w:start w:val="1"/>
+      <w:numFmt w:val="bullet"/>
+      <w:lvlText w:val=""/>
+      <w:lvlJc w:val="left"/>
+      <w:pPr>
+        <w:tabs>
+          <w:tab w:val="num" w:pos="2880"/>
+        </w:tabs>
+        <w:ind w:left="2880" w:hanging="360"/>
+      </w:pPr>
+      <w:rPr>
+        <w:rFonts w:ascii="Wingdings" w:hAnsi="Wingdings" w:hint="default"/>
+        <w:sz w:val="20"/>
+      </w:rPr>
+    </w:lvl>
+    <w:lvl w:ilvl="4" w:tentative="1">
+      <w:start w:val="1"/>
+      <w:numFmt w:val="bullet"/>
+      <w:lvlText w:val=""/>
+      <w:lvlJc w:val="left"/>
+      <w:pPr>
+        <w:tabs>
+          <w:tab w:val="num" w:pos="3600"/>
+        </w:tabs>
+        <w:ind w:left="3600" w:hanging="360"/>
+      </w:pPr>
+      <w:rPr>
+        <w:rFonts w:ascii="Wingdings" w:hAnsi="Wingdings" w:hint="default"/>
+        <w:sz w:val="20"/>
+      </w:rPr>
+    </w:lvl>
+    <w:lvl w:ilvl="5" w:tentative="1">
+      <w:start w:val="1"/>
+      <w:numFmt w:val="bullet"/>
+      <w:lvlText w:val=""/>
+      <w:lvlJc w:val="left"/>
+      <w:pPr>
+        <w:tabs>
+          <w:tab w:val="num" w:pos="4320"/>
+        </w:tabs>
+        <w:ind w:left="4320" w:hanging="360"/>
+      </w:pPr>
+      <w:rPr>
+        <w:rFonts w:ascii="Wingdings" w:hAnsi="Wingdings" w:hint="default"/>
+        <w:sz w:val="20"/>
+      </w:rPr>
+    </w:lvl>
+    <w:lvl w:ilvl="6" w:tentative="1">
+      <w:start w:val="1"/>
+      <w:numFmt w:val="bullet"/>
+      <w:lvlText w:val=""/>
+      <w:lvlJc w:val="left"/>
+      <w:pPr>
+        <w:tabs>
+          <w:tab w:val="num" w:pos="5040"/>
+        </w:tabs>
+        <w:ind w:left="5040" w:hanging="360"/>
+      </w:pPr>
+      <w:rPr>
+        <w:rFonts w:ascii="Wingdings" w:hAnsi="Wingdings" w:hint="default"/>
+        <w:sz w:val="20"/>
+      </w:rPr>
+    </w:lvl>
+    <w:lvl w:ilvl="7" w:tentative="1">
+      <w:start w:val="1"/>
+      <w:numFmt w:val="bullet"/>
+      <w:lvlText w:val=""/>
+      <w:lvlJc w:val="left"/>
+      <w:pPr>
+        <w:tabs>
+          <w:tab w:val="num" w:pos="5760"/>
+        </w:tabs>
+        <w:ind w:left="5760" w:hanging="360"/>
+      </w:pPr>
+      <w:rPr>
+        <w:rFonts w:ascii="Wingdings" w:hAnsi="Wingdings" w:hint="default"/>
+        <w:sz w:val="20"/>
+      </w:rPr>
+    </w:lvl>
+    <w:lvl w:ilvl="8" w:tentative="1">
+      <w:start w:val="1"/>
+      <w:numFmt w:val="bullet"/>
+      <w:lvlText w:val=""/>
+      <w:lvlJc w:val="left"/>
+      <w:pPr>
+        <w:tabs>
+          <w:tab w:val="num" w:pos="6480"/>
+        </w:tabs>
+        <w:ind w:left="6480" w:hanging="360"/>
+      </w:pPr>
+      <w:rPr>
+        <w:rFonts w:ascii="Wingdings" w:hAnsi="Wingdings" w:hint="default"/>
+        <w:sz w:val="20"/>
+      </w:rPr>
+    </w:lvl>
+  </w:abstractNum>
+  <w:abstractNum w:abstractNumId="8" w15:restartNumberingAfterBreak="0">
     <w:nsid w:val="5BF4610A"/>
     <w:multiLevelType w:val="multilevel"/>
     <w:tmpl w:val="27707B8C"/>
@@ -2559,7 +6534,7 @@
       </w:rPr>
     </w:lvl>
   </w:abstractNum>
-  <w:abstractNum w:abstractNumId="5" w15:restartNumberingAfterBreak="0">
+  <w:abstractNum w:abstractNumId="9" w15:restartNumberingAfterBreak="0">
     <w:nsid w:val="750B0806"/>
     <w:multiLevelType w:val="multilevel"/>
     <w:tmpl w:val="EDD46BC6"/>
@@ -2708,7 +6683,7 @@
       </w:rPr>
     </w:lvl>
   </w:abstractNum>
-  <w:abstractNum w:abstractNumId="6" w15:restartNumberingAfterBreak="0">
+  <w:abstractNum w:abstractNumId="10" w15:restartNumberingAfterBreak="0">
     <w:nsid w:val="7760739D"/>
     <w:multiLevelType w:val="multilevel"/>
     <w:tmpl w:val="56C09234"/>
@@ -2829,26 +6804,190 @@
       </w:pPr>
     </w:lvl>
   </w:abstractNum>
+  <w:abstractNum w:abstractNumId="11" w15:restartNumberingAfterBreak="0">
+    <w:nsid w:val="7C785521"/>
+    <w:multiLevelType w:val="multilevel"/>
+    <w:tmpl w:val="10FAAF86"/>
+    <w:lvl w:ilvl="0">
+      <w:start w:val="1"/>
+      <w:numFmt w:val="bullet"/>
+      <w:lvlText w:val=""/>
+      <w:lvlJc w:val="left"/>
+      <w:pPr>
+        <w:tabs>
+          <w:tab w:val="num" w:pos="720"/>
+        </w:tabs>
+        <w:ind w:left="720" w:hanging="360"/>
+      </w:pPr>
+      <w:rPr>
+        <w:rFonts w:ascii="Symbol" w:hAnsi="Symbol" w:hint="default"/>
+        <w:sz w:val="20"/>
+      </w:rPr>
+    </w:lvl>
+    <w:lvl w:ilvl="1" w:tentative="1">
+      <w:start w:val="1"/>
+      <w:numFmt w:val="bullet"/>
+      <w:lvlText w:val="o"/>
+      <w:lvlJc w:val="left"/>
+      <w:pPr>
+        <w:tabs>
+          <w:tab w:val="num" w:pos="1440"/>
+        </w:tabs>
+        <w:ind w:left="1440" w:hanging="360"/>
+      </w:pPr>
+      <w:rPr>
+        <w:rFonts w:ascii="Courier New" w:hAnsi="Courier New" w:hint="default"/>
+        <w:sz w:val="20"/>
+      </w:rPr>
+    </w:lvl>
+    <w:lvl w:ilvl="2" w:tentative="1">
+      <w:start w:val="1"/>
+      <w:numFmt w:val="bullet"/>
+      <w:lvlText w:val=""/>
+      <w:lvlJc w:val="left"/>
+      <w:pPr>
+        <w:tabs>
+          <w:tab w:val="num" w:pos="2160"/>
+        </w:tabs>
+        <w:ind w:left="2160" w:hanging="360"/>
+      </w:pPr>
+      <w:rPr>
+        <w:rFonts w:ascii="Wingdings" w:hAnsi="Wingdings" w:hint="default"/>
+        <w:sz w:val="20"/>
+      </w:rPr>
+    </w:lvl>
+    <w:lvl w:ilvl="3" w:tentative="1">
+      <w:start w:val="1"/>
+      <w:numFmt w:val="bullet"/>
+      <w:lvlText w:val=""/>
+      <w:lvlJc w:val="left"/>
+      <w:pPr>
+        <w:tabs>
+          <w:tab w:val="num" w:pos="2880"/>
+        </w:tabs>
+        <w:ind w:left="2880" w:hanging="360"/>
+      </w:pPr>
+      <w:rPr>
+        <w:rFonts w:ascii="Wingdings" w:hAnsi="Wingdings" w:hint="default"/>
+        <w:sz w:val="20"/>
+      </w:rPr>
+    </w:lvl>
+    <w:lvl w:ilvl="4" w:tentative="1">
+      <w:start w:val="1"/>
+      <w:numFmt w:val="bullet"/>
+      <w:lvlText w:val=""/>
+      <w:lvlJc w:val="left"/>
+      <w:pPr>
+        <w:tabs>
+          <w:tab w:val="num" w:pos="3600"/>
+        </w:tabs>
+        <w:ind w:left="3600" w:hanging="360"/>
+      </w:pPr>
+      <w:rPr>
+        <w:rFonts w:ascii="Wingdings" w:hAnsi="Wingdings" w:hint="default"/>
+        <w:sz w:val="20"/>
+      </w:rPr>
+    </w:lvl>
+    <w:lvl w:ilvl="5" w:tentative="1">
+      <w:start w:val="1"/>
+      <w:numFmt w:val="bullet"/>
+      <w:lvlText w:val=""/>
+      <w:lvlJc w:val="left"/>
+      <w:pPr>
+        <w:tabs>
+          <w:tab w:val="num" w:pos="4320"/>
+        </w:tabs>
+        <w:ind w:left="4320" w:hanging="360"/>
+      </w:pPr>
+      <w:rPr>
+        <w:rFonts w:ascii="Wingdings" w:hAnsi="Wingdings" w:hint="default"/>
+        <w:sz w:val="20"/>
+      </w:rPr>
+    </w:lvl>
+    <w:lvl w:ilvl="6" w:tentative="1">
+      <w:start w:val="1"/>
+      <w:numFmt w:val="bullet"/>
+      <w:lvlText w:val=""/>
+      <w:lvlJc w:val="left"/>
+      <w:pPr>
+        <w:tabs>
+          <w:tab w:val="num" w:pos="5040"/>
+        </w:tabs>
+        <w:ind w:left="5040" w:hanging="360"/>
+      </w:pPr>
+      <w:rPr>
+        <w:rFonts w:ascii="Wingdings" w:hAnsi="Wingdings" w:hint="default"/>
+        <w:sz w:val="20"/>
+      </w:rPr>
+    </w:lvl>
+    <w:lvl w:ilvl="7" w:tentative="1">
+      <w:start w:val="1"/>
+      <w:numFmt w:val="bullet"/>
+      <w:lvlText w:val=""/>
+      <w:lvlJc w:val="left"/>
+      <w:pPr>
+        <w:tabs>
+          <w:tab w:val="num" w:pos="5760"/>
+        </w:tabs>
+        <w:ind w:left="5760" w:hanging="360"/>
+      </w:pPr>
+      <w:rPr>
+        <w:rFonts w:ascii="Wingdings" w:hAnsi="Wingdings" w:hint="default"/>
+        <w:sz w:val="20"/>
+      </w:rPr>
+    </w:lvl>
+    <w:lvl w:ilvl="8" w:tentative="1">
+      <w:start w:val="1"/>
+      <w:numFmt w:val="bullet"/>
+      <w:lvlText w:val=""/>
+      <w:lvlJc w:val="left"/>
+      <w:pPr>
+        <w:tabs>
+          <w:tab w:val="num" w:pos="6480"/>
+        </w:tabs>
+        <w:ind w:left="6480" w:hanging="360"/>
+      </w:pPr>
+      <w:rPr>
+        <w:rFonts w:ascii="Wingdings" w:hAnsi="Wingdings" w:hint="default"/>
+        <w:sz w:val="20"/>
+      </w:rPr>
+    </w:lvl>
+  </w:abstractNum>
   <w:num w:numId="1" w16cid:durableId="982078522">
-    <w:abstractNumId w:val="1"/>
+    <w:abstractNumId w:val="3"/>
   </w:num>
   <w:num w:numId="2" w16cid:durableId="102071625">
-    <w:abstractNumId w:val="5"/>
+    <w:abstractNumId w:val="9"/>
   </w:num>
   <w:num w:numId="3" w16cid:durableId="400297850">
     <w:abstractNumId w:val="0"/>
   </w:num>
   <w:num w:numId="4" w16cid:durableId="263194302">
-    <w:abstractNumId w:val="4"/>
+    <w:abstractNumId w:val="8"/>
   </w:num>
   <w:num w:numId="5" w16cid:durableId="1241408281">
-    <w:abstractNumId w:val="3"/>
+    <w:abstractNumId w:val="6"/>
   </w:num>
   <w:num w:numId="6" w16cid:durableId="1047878203">
-    <w:abstractNumId w:val="6"/>
+    <w:abstractNumId w:val="10"/>
   </w:num>
   <w:num w:numId="7" w16cid:durableId="549802831">
+    <w:abstractNumId w:val="5"/>
+  </w:num>
+  <w:num w:numId="8" w16cid:durableId="293830069">
+    <w:abstractNumId w:val="1"/>
+  </w:num>
+  <w:num w:numId="9" w16cid:durableId="506092504">
+    <w:abstractNumId w:val="7"/>
+  </w:num>
+  <w:num w:numId="10" w16cid:durableId="438331041">
     <w:abstractNumId w:val="2"/>
+  </w:num>
+  <w:num w:numId="11" w16cid:durableId="523976872">
+    <w:abstractNumId w:val="11"/>
+  </w:num>
+  <w:num w:numId="12" w16cid:durableId="1281185129">
+    <w:abstractNumId w:val="4"/>
   </w:num>
 </w:numbering>
 </file>

</xml_diff>